<commit_message>
Adicionar documentação do Trabalho 3
Criar documentação do Contaê com descrição da implementação do Room, decisões técnicas, dificuldades encontradas, roteiro de testes e checklist dos requisitos para entrega.
</commit_message>
<xml_diff>
--- a/Documentacao_Contae_Trabalho_3_Room.docx
+++ b/Documentacao_Contae_Trabalho_3_Room.docx
@@ -4093,7 +4093,7 @@
         <w:rPr>
           <w:rFonts w:ascii="Carlito" w:eastAsia="Carlito" w:hAnsi="Carlito"/>
         </w:rPr>
-        <w:t>7.4 Reflexão do trio — completar com a experiência real</w:t>
+        <w:t xml:space="preserve">7.4 Reflexão do trio </w:t>
       </w:r>
     </w:p>
     <w:p>
@@ -5632,119 +5632,9 @@
         <w:t>O escopo usa Room/SQLite local, sem backend, API, autenticação real, sincronização entre dispositivos ou nuvem. O foco é persistir o CRUD do app existente, sem arquitetura avançada.</w:t>
       </w:r>
     </w:p>
-    <w:p>
-      <w:pPr>
-        <w:pStyle w:val="Ttulo2"/>
-      </w:pPr>
-      <w:r>
-        <w:rPr>
-          <w:rFonts w:ascii="Carlito" w:eastAsia="Carlito" w:hAnsi="Carlito"/>
-        </w:rPr>
-        <w:t>11. Repositório e entrega</w:t>
-      </w:r>
-    </w:p>
-    <w:p>
-      <w:r>
-        <w:rPr>
-          <w:b/>
-          <w:sz w:val="20"/>
-        </w:rPr>
-        <w:t xml:space="preserve">Repositório do projeto: </w:t>
-      </w:r>
-      <w:hyperlink r:id="rId10">
-        <w:r>
-          <w:rPr>
-            <w:color w:val="18745B"/>
-            <w:u w:val="single"/>
-          </w:rPr>
-          <w:t>github.com/aguustinn/Contae-pt3</w:t>
-        </w:r>
-      </w:hyperlink>
-    </w:p>
-    <w:p>
-      <w:r>
-        <w:rPr>
-          <w:sz w:val="19"/>
-        </w:rPr>
-        <w:t>Confirmar o prazo e adicionar ao README os passos de execução e links das evidências reais.</w:t>
-      </w:r>
-    </w:p>
-    <w:tbl>
-      <w:tblPr>
-        <w:tblW w:w="0" w:type="auto"/>
-        <w:jc w:val="center"/>
-        <w:tblLook w:val="04A0" w:firstRow="1" w:lastRow="0" w:firstColumn="1" w:lastColumn="0" w:noHBand="0" w:noVBand="1"/>
-      </w:tblPr>
-      <w:tblGrid>
-        <w:gridCol w:w="9663"/>
-      </w:tblGrid>
-      <w:tr>
-        <w:trPr>
-          <w:jc w:val="center"/>
-        </w:trPr>
-        <w:tc>
-          <w:tcPr>
-            <w:tcW w:w="9663" w:type="dxa"/>
-            <w:tcBorders>
-              <w:top w:val="nil"/>
-              <w:left w:val="single" w:sz="22" w:space="0" w:color="18745B"/>
-              <w:bottom w:val="nil"/>
-              <w:right w:val="nil"/>
-            </w:tcBorders>
-            <w:shd w:val="clear" w:color="auto" w:fill="DDF3E8"/>
-            <w:tcMar>
-              <w:top w:w="145" w:type="dxa"/>
-              <w:left w:w="190" w:type="dxa"/>
-              <w:bottom w:w="140" w:type="dxa"/>
-              <w:right w:w="190" w:type="dxa"/>
-            </w:tcMar>
-          </w:tcPr>
-          <w:p>
-            <w:pPr>
-              <w:spacing w:after="80"/>
-            </w:pPr>
-            <w:r>
-              <w:rPr>
-                <w:b/>
-                <w:color w:val="18745B"/>
-              </w:rPr>
-              <w:t>CRITÉRIO DECISIVO NA APRESENTAÇÃO</w:t>
-            </w:r>
-          </w:p>
-          <w:p>
-            <w:pPr>
-              <w:spacing w:after="0" w:line="259" w:lineRule="auto"/>
-            </w:pPr>
-            <w:r>
-              <w:rPr>
-                <w:sz w:val="19"/>
-              </w:rPr>
-              <w:t>Demonstrar o CRUD e fechar/reabrir completamente o app para comprovar que os dados persistiram.</w:t>
-            </w:r>
-          </w:p>
-        </w:tc>
-      </w:tr>
-    </w:tbl>
-    <w:p>
-      <w:pPr>
-        <w:spacing w:after="20"/>
-      </w:pPr>
-    </w:p>
-    <w:p>
-      <w:pPr>
-        <w:spacing w:after="40"/>
-      </w:pPr>
-      <w:r>
-        <w:rPr>
-          <w:color w:val="61736C"/>
-          <w:sz w:val="18"/>
-        </w:rPr>
-        <w:t>Dúvidas: aselleti@up.edu.br (preferencialmente pelo Blackboard).</w:t>
-      </w:r>
-    </w:p>
     <w:sectPr>
-      <w:headerReference w:type="default" r:id="rId11"/>
-      <w:footerReference w:type="default" r:id="rId12"/>
+      <w:headerReference w:type="default" r:id="rId10"/>
+      <w:footerReference w:type="default" r:id="rId11"/>
       <w:pgSz w:w="11909" w:h="16834"/>
       <w:pgMar w:top="979" w:right="1123" w:bottom="936" w:left="1123" w:header="461" w:footer="461" w:gutter="0"/>
       <w:cols w:space="720"/>
@@ -5787,21 +5677,12 @@
       <w:spacing w:before="40"/>
       <w:jc w:val="center"/>
     </w:pPr>
-    <w:proofErr w:type="gramStart"/>
     <w:r>
       <w:rPr>
         <w:color w:val="61736C"/>
         <w:sz w:val="17"/>
       </w:rPr>
-      <w:t>CONTAÊ  •</w:t>
-    </w:r>
-    <w:proofErr w:type="gramEnd"/>
-    <w:r>
-      <w:rPr>
-        <w:color w:val="61736C"/>
-        <w:sz w:val="17"/>
-      </w:rPr>
-      <w:t xml:space="preserve">  </w:t>
+      <w:t xml:space="preserve">CONTAÊ  •  </w:t>
     </w:r>
     <w:proofErr w:type="spellStart"/>
     <w:r>

</xml_diff>

<commit_message>
Subindo gravação e documentação
</commit_message>
<xml_diff>
--- a/Documentacao_Contae_Trabalho_3_Room.docx
+++ b/Documentacao_Contae_Trabalho_3_Room.docx
@@ -1,6 +1,6 @@
 
 <file path=word/document.xml><?xml version="1.0" encoding="utf-8"?>
-<w:document xmlns:wpc="http://schemas.microsoft.com/office/word/2010/wordprocessingCanvas" xmlns:cx="http://schemas.microsoft.com/office/drawing/2014/chartex" xmlns:cx1="http://schemas.microsoft.com/office/drawing/2015/9/8/chartex" xmlns:cx2="http://schemas.microsoft.com/office/drawing/2015/10/21/chartex" xmlns:cx3="http://schemas.microsoft.com/office/drawing/2016/5/9/chartex" xmlns:cx4="http://schemas.microsoft.com/office/drawing/2016/5/10/chartex" xmlns:cx5="http://schemas.microsoft.com/office/drawing/2016/5/11/chartex" xmlns:cx6="http://schemas.microsoft.com/office/drawing/2016/5/12/chartex" xmlns:cx7="http://schemas.microsoft.com/office/drawing/2016/5/13/chartex" xmlns:cx8="http://schemas.microsoft.com/office/drawing/2016/5/14/chartex" xmlns:mc="http://schemas.openxmlformats.org/markup-compatibility/2006" xmlns:aink="http://schemas.microsoft.com/office/drawing/2016/ink" xmlns:am3d="http://schemas.microsoft.com/office/drawing/2017/model3d" xmlns:o="urn:schemas-microsoft-com:office:office" xmlns:oel="http://schemas.microsoft.com/office/2019/extlst" xmlns:r="http://schemas.openxmlformats.org/officeDocument/2006/relationships" xmlns:m="http://schemas.openxmlformats.org/officeDocument/2006/math" xmlns:v="urn:schemas-microsoft-com:vml" xmlns:wp14="http://schemas.microsoft.com/office/word/2010/wordprocessingDrawing" xmlns:wp="http://schemas.openxmlformats.org/drawingml/2006/wordprocessingDrawing" xmlns:w10="urn:schemas-microsoft-com:office:word" xmlns:w="http://schemas.openxmlformats.org/wordprocessingml/2006/main" xmlns:w14="http://schemas.microsoft.com/office/word/2010/wordml" xmlns:w15="http://schemas.microsoft.com/office/word/2012/wordml" xmlns:w16cex="http://schemas.microsoft.com/office/word/2018/wordml/cex" xmlns:w16cid="http://schemas.microsoft.com/office/word/2016/wordml/cid" xmlns:w16="http://schemas.microsoft.com/office/word/2018/wordml" xmlns:w16du="http://schemas.microsoft.com/office/word/2023/wordml/word16du" xmlns:w16sdtdh="http://schemas.microsoft.com/office/word/2020/wordml/sdtdatahash" xmlns:w16sdtfl="http://schemas.microsoft.com/office/word/2024/wordml/sdtformatlock" xmlns:w16se="http://schemas.microsoft.com/office/word/2015/wordml/symex" xmlns:wpg="http://schemas.microsoft.com/office/word/2010/wordprocessingGroup" xmlns:wpi="http://schemas.microsoft.com/office/word/2010/wordprocessingInk" xmlns:wne="http://schemas.microsoft.com/office/word/2006/wordml" xmlns:wps="http://schemas.microsoft.com/office/word/2010/wordprocessingShape" mc:Ignorable="w14 w15 w16se w16cid w16 w16cex w16sdtdh w16sdtfl w16du wp14">
+<w:document xmlns:wpc="http://schemas.microsoft.com/office/word/2010/wordprocessingCanvas" xmlns:cx="http://schemas.microsoft.com/office/drawing/2014/chartex" xmlns:cx1="http://schemas.microsoft.com/office/drawing/2015/9/8/chartex" xmlns:cx2="http://schemas.microsoft.com/office/drawing/2015/10/21/chartex" xmlns:cx3="http://schemas.microsoft.com/office/drawing/2016/5/9/chartex" xmlns:cx4="http://schemas.microsoft.com/office/drawing/2016/5/10/chartex" xmlns:cx5="http://schemas.microsoft.com/office/drawing/2016/5/11/chartex" xmlns:cx6="http://schemas.microsoft.com/office/drawing/2016/5/12/chartex" xmlns:cx7="http://schemas.microsoft.com/office/drawing/2016/5/13/chartex" xmlns:cx8="http://schemas.microsoft.com/office/drawing/2016/5/14/chartex" xmlns:mc="http://schemas.openxmlformats.org/markup-compatibility/2006" xmlns:aink="http://schemas.microsoft.com/office/drawing/2016/ink" xmlns:am3d="http://schemas.microsoft.com/office/drawing/2017/model3d" xmlns:o="urn:schemas-microsoft-com:office:office" xmlns:r="http://schemas.openxmlformats.org/officeDocument/2006/relationships" xmlns:m="http://schemas.openxmlformats.org/officeDocument/2006/math" xmlns:v="urn:schemas-microsoft-com:vml" xmlns:wp14="http://schemas.microsoft.com/office/word/2010/wordprocessingDrawing" xmlns:wp="http://schemas.openxmlformats.org/drawingml/2006/wordprocessingDrawing" xmlns:w10="urn:schemas-microsoft-com:office:word" xmlns:w="http://schemas.openxmlformats.org/wordprocessingml/2006/main" xmlns:w14="http://schemas.microsoft.com/office/word/2010/wordml" xmlns:w15="http://schemas.microsoft.com/office/word/2012/wordml" xmlns:w16cex="http://schemas.microsoft.com/office/word/2018/wordml/cex" xmlns:w16cid="http://schemas.microsoft.com/office/word/2016/wordml/cid" xmlns:w16="http://schemas.microsoft.com/office/word/2018/wordml" xmlns:w16sdtdh="http://schemas.microsoft.com/office/word/2020/wordml/sdtdatahash" xmlns:w16se="http://schemas.microsoft.com/office/word/2015/wordml/symex" xmlns:wpg="http://schemas.microsoft.com/office/word/2010/wordprocessingGroup" xmlns:wpi="http://schemas.microsoft.com/office/word/2010/wordprocessingInk" xmlns:wne="http://schemas.microsoft.com/office/word/2006/wordml" xmlns:wps="http://schemas.microsoft.com/office/word/2010/wordprocessingShape" mc:Ignorable="w14 w15 w16se w16cid w16 w16cex w16sdtdh wp14">
   <w:body>
     <w:p>
       <w:pPr>
@@ -200,17 +200,8 @@
                 <w:color w:val="61736C"/>
                 <w:sz w:val="18"/>
               </w:rPr>
-              <w:t xml:space="preserve">Agustin Penelas, Agustin Lautaro, Kleber </w:t>
-            </w:r>
-            <w:proofErr w:type="spellStart"/>
-            <w:r>
-              <w:rPr>
-                <w:color w:val="61736C"/>
-                <w:sz w:val="18"/>
-              </w:rPr>
-              <w:t>Ludorf</w:t>
-            </w:r>
-            <w:proofErr w:type="spellEnd"/>
+              <w:t>Agustin Penelas, Agustin Lautaro, Kleber Ludorf</w:t>
+            </w:r>
           </w:p>
         </w:tc>
       </w:tr>
@@ -414,7 +405,10 @@
     </w:p>
     <w:p>
       <w:r>
-        <w:t>Este documento registra a evolução do Contaê do Trabalho 2 para o Trabalho 3. A principal mudança é a substituição do armazenamento exclusivamente em memória por persistência local com Room, biblioteca Android que abstrai o SQLite e permite consultar e modificar registros por meio de entidades Kotlin e DAOs.</w:t>
+        <w:t>Este documento registra a evolução do Contaê do Trabalho 2 para o Trabalho 3. A principal mudança é a substituição do armazenamento exclusivamente em memória por persistência local com Room, biblioteca Android que abstrai o SQLite e permit</w:t>
+      </w:r>
+      <w:r>
+        <w:t>e consultar e modificar registros por meio de entidades Kotlin e DAOs.</w:t>
       </w:r>
     </w:p>
     <w:tbl>
@@ -467,7 +461,13 @@
               <w:rPr>
                 <w:sz w:val="19"/>
               </w:rPr>
-              <w:t>Manter as telas e o fluxo de navegação já existentes e fazer com que cadastrar, editar, excluir e consultar categorias e despesas opere sobre um banco local, sem exigir servidor, API ou sincronização em nuvem.</w:t>
+              <w:t xml:space="preserve">Manter as telas e o fluxo de navegação já existentes e fazer com que cadastrar, editar, excluir e consultar categorias e despesas opere sobre um banco local, sem </w:t>
+            </w:r>
+            <w:r>
+              <w:rPr>
+                <w:sz w:val="19"/>
+              </w:rPr>
+              <w:t>exigir servidor, API ou sincronização em nuvem.</w:t>
             </w:r>
           </w:p>
         </w:tc>
@@ -491,7 +491,10 @@
     </w:p>
     <w:p>
       <w:r>
-        <w:t>No Trabalho 2, o Contaê já possuía telas construídas com Jetpack Compose, navegação com NavHost, formulários e listas observáveis. As coleções `Dados.categorias` e `Dados.despesas` eram preenchidas com exemplos e mantidas em `mutableStateListOf`. Essa abordagem era suficiente para interações durante a execução, mas não garantia que os registros continuassem disponíveis após encerrar o processo do aplicativo.</w:t>
+        <w:t>No Trabalho 2, o Contaê já possuía telas construídas com Jetpack Compose, navegação com NavHost, formulários e listas observáveis. As coleções `Dados.categorias` e `Da</w:t>
+      </w:r>
+      <w:r>
+        <w:t>dos.despesas` eram preenchidas com exemplos e mantidas em `mutableStateListOf`. Essa abordagem era suficiente para interações durante a execução, mas não garantia que os registros continuassem disponíveis após encerrar o processo do aplicativo.</w:t>
       </w:r>
     </w:p>
     <w:p>
@@ -502,7 +505,13 @@
         <w:rPr>
           <w:rFonts w:ascii="Carlito" w:eastAsia="Carlito" w:hAnsi="Carlito"/>
         </w:rPr>
-        <w:t>2. O que mudou no Trabalho 3</w:t>
+        <w:t>2. O que mu</w:t>
+      </w:r>
+      <w:r>
+        <w:rPr>
+          <w:rFonts w:ascii="Carlito" w:eastAsia="Carlito" w:hAnsi="Carlito"/>
+        </w:rPr>
+        <w:t>dou no Trabalho 3</w:t>
       </w:r>
     </w:p>
     <w:tbl>
@@ -698,7 +707,13 @@
               <w:rPr>
                 <w:sz w:val="18"/>
               </w:rPr>
-              <w:t>O cadastro chama operações de inserção do DAO dentro de coroutine.</w:t>
+              <w:t xml:space="preserve">O cadastro chama operações de </w:t>
+            </w:r>
+            <w:r>
+              <w:rPr>
+                <w:sz w:val="18"/>
+              </w:rPr>
+              <w:t>inserção do DAO dentro de coroutine.</w:t>
             </w:r>
           </w:p>
         </w:tc>
@@ -820,7 +835,13 @@
               <w:rPr>
                 <w:sz w:val="18"/>
               </w:rPr>
-              <w:t>A exclusão remove o registro do banco e sincroniza as listas da interface.</w:t>
+              <w:t xml:space="preserve">A exclusão remove o registro do banco e sincroniza as listas da </w:t>
+            </w:r>
+            <w:r>
+              <w:rPr>
+                <w:sz w:val="18"/>
+              </w:rPr>
+              <w:t>interface.</w:t>
             </w:r>
           </w:p>
         </w:tc>
@@ -905,7 +926,10 @@
     </w:p>
     <w:p>
       <w:r>
-        <w:t>O objetivo foi reaproveitar o projeto do Trabalho 2, sem criar novas funcionalidades de interface como foco do trabalho. O esforço concentrou-se na camada de dados, na persistência e na demonstração do ciclo completo de CRUD. A interface continua usando componentes Compose e navegação já existentes.</w:t>
+        <w:t xml:space="preserve">O objetivo foi reaproveitar o projeto do Trabalho 2, sem criar novas </w:t>
+      </w:r>
+      <w:r>
+        <w:t>funcionalidades de interface como foco do trabalho. O esforço concentrou-se na camada de dados, na persistência e na demonstração do ciclo completo de CRUD. A interface continua usando componentes Compose e navegação já existentes.</w:t>
       </w:r>
     </w:p>
     <w:tbl>
@@ -947,7 +971,14 @@
                 <w:b/>
                 <w:color w:val="D9A441"/>
               </w:rPr>
-              <w:t>IMPORTANTE SOBRE A VALIDAÇÃO</w:t>
+              <w:t>IMPORTANTE SOBRE A VALID</w:t>
+            </w:r>
+            <w:r>
+              <w:rPr>
+                <w:b/>
+                <w:color w:val="D9A441"/>
+              </w:rPr>
+              <w:t>AÇÃO</w:t>
             </w:r>
           </w:p>
           <w:p>
@@ -979,12 +1010,21 @@
           <w:rFonts w:ascii="Carlito" w:eastAsia="Carlito" w:hAnsi="Carlito"/>
         </w:rPr>
         <w:lastRenderedPageBreak/>
-        <w:t>4. Arquitetura da persistência</w:t>
+        <w:t>4. Arquitetura da p</w:t>
+      </w:r>
+      <w:r>
+        <w:rPr>
+          <w:rFonts w:ascii="Carlito" w:eastAsia="Carlito" w:hAnsi="Carlito"/>
+        </w:rPr>
+        <w:t>ersistência</w:t>
       </w:r>
     </w:p>
     <w:p>
       <w:r>
-        <w:t>O Room é a fonte persistente dos dados. O objeto `Dados` mantém listas observáveis para que a interface seja atualizada pelo Compose, mas essas listas funcionam como cache de apresentação: a leitura e as alterações definitivas são realizadas no banco.</w:t>
+        <w:t>O Room é a fonte persistente dos dados. O objeto `Dados` mantém listas observáveis para que a interface seja atualizada pelo Compose, mas essas listas funcionam como cache de apresentação: a leitura e as alterações definitivas são realizadas no</w:t>
+      </w:r>
+      <w:r>
+        <w:t xml:space="preserve"> banco.</w:t>
       </w:r>
     </w:p>
     <w:p>
@@ -1190,7 +1230,13 @@
               <w:rPr>
                 <w:sz w:val="18"/>
               </w:rPr>
-              <w:t>Apresentam listas, formulários e detalhes; usam LaunchedEffect para iniciar o carregamento.</w:t>
+              <w:t xml:space="preserve">Apresentam listas, formulários e detalhes; usam LaunchedEffect para </w:t>
+            </w:r>
+            <w:r>
+              <w:rPr>
+                <w:sz w:val="18"/>
+              </w:rPr>
+              <w:t>iniciar o carregamento.</w:t>
             </w:r>
           </w:p>
         </w:tc>
@@ -1458,7 +1504,13 @@
     </w:p>
     <w:p>
       <w:r>
-        <w:t>As funções dos DAOs são `suspend`, e o acesso ao SQLite não deve bloquear a thread principal. A camada de dados executa as operações com `CoroutineScope(SupervisorJob() + Dispatchers.IO)` e utiliza `withContext(Dispatchers.IO)` nas leituras que devolvem resultados. Assim, a interface permanece responsiva enquanto o banco é acessado.</w:t>
+        <w:t xml:space="preserve">As funções dos DAOs </w:t>
+      </w:r>
+      <w:r>
+        <w:t>são `suspend`, e o acesso ao SQLite não deve bloquear a thread principal. A camada de dados executa as operações com `CoroutineScope(SupervisorJob() + Dispatchers.IO)` e utiliza `withContext(Dispatchers.IO)` nas leituras que devolvem resultados. Assim, a i</w:t>
+      </w:r>
+      <w:r>
+        <w:t>nterface permanece responsiva enquanto o banco é acessado.</w:t>
       </w:r>
     </w:p>
     <w:tbl>
@@ -1511,7 +1563,13 @@
               <w:rPr>
                 <w:sz w:val="19"/>
               </w:rPr>
-              <w:t>O projeto mantém uma camada de dados simples, adequada ao escopo da atividade. Não foi introduzida uma arquitetura mais complexa, pois a rubrica solicita principalmente aplicar Room ao aplicativo existente.</w:t>
+              <w:t>O projeto mantém uma camada de dados simples, adequada ao escopo da atividade. Não foi introduzida uma arquitetura mais complexa, pois a rubrica solicita principalmente apl</w:t>
+            </w:r>
+            <w:r>
+              <w:rPr>
+                <w:sz w:val="19"/>
+              </w:rPr>
+              <w:t>icar Room ao aplicativo existente.</w:t>
             </w:r>
           </w:p>
         </w:tc>
@@ -1548,7 +1606,10 @@
     </w:p>
     <w:p>
       <w:r>
-        <w:t>A entidade representa uma categoria de orçamento. O ID é gerado automaticamente; `nome` identifica o agrupamento exibido na interface; `limite` representa o teto de gasto usado nos cálculos de orçamento.</w:t>
+        <w:t xml:space="preserve">A entidade representa uma categoria de orçamento. O ID é gerado automaticamente; `nome` identifica o agrupamento exibido na interface; `limite` </w:t>
+      </w:r>
+      <w:r>
+        <w:t>representa o teto de gasto usado nos cálculos de orçamento.</w:t>
       </w:r>
     </w:p>
     <w:p>
@@ -1707,7 +1768,15 @@
           <w:color w:val="61736C"/>
           <w:sz w:val="18"/>
         </w:rPr>
-        <w:t>Trecho ilustrativo — Despesa.kt</w:t>
+        <w:t>Trecho ilustrativo — Desp</w:t>
+      </w:r>
+      <w:r>
+        <w:rPr>
+          <w:b/>
+          <w:color w:val="61736C"/>
+          <w:sz w:val="18"/>
+        </w:rPr>
+        <w:t>esa.kt</w:t>
       </w:r>
     </w:p>
     <w:tbl>
@@ -1961,7 +2030,15 @@
                 <w:color w:val="FFFFFF"/>
                 <w:sz w:val="18"/>
               </w:rPr>
-              <w:t>Finalidade</w:t>
+              <w:t>Finali</w:t>
+            </w:r>
+            <w:r>
+              <w:rPr>
+                <w:b/>
+                <w:color w:val="FFFFFF"/>
+                <w:sz w:val="18"/>
+              </w:rPr>
+              <w:t>dade</w:t>
             </w:r>
           </w:p>
         </w:tc>
@@ -2577,7 +2654,13 @@
               <w:rPr>
                 <w:sz w:val="17"/>
               </w:rPr>
-              <w:t>Lista as despesas, da mais recente inserida para a mais antiga.</w:t>
+              <w:t xml:space="preserve">Lista as despesas, da mais recente </w:t>
+            </w:r>
+            <w:r>
+              <w:rPr>
+                <w:sz w:val="17"/>
+              </w:rPr>
+              <w:t>inserida para a mais antiga.</w:t>
             </w:r>
           </w:p>
         </w:tc>
@@ -2841,7 +2924,13 @@
               <w:rPr>
                 <w:sz w:val="17"/>
               </w:rPr>
-              <w:t>Atualiza ou exclui uma despesa existente.</w:t>
+              <w:t xml:space="preserve">Atualiza ou exclui uma </w:t>
+            </w:r>
+            <w:r>
+              <w:rPr>
+                <w:sz w:val="17"/>
+              </w:rPr>
+              <w:t>despesa existente.</w:t>
             </w:r>
           </w:p>
         </w:tc>
@@ -2865,7 +2954,10 @@
     </w:p>
     <w:p>
       <w:r>
-        <w:t>A classe `AppDatabase` herda de `RoomDatabase`, declara `Categoria` e `Despesa` em `@Database(entities = [...], version = 1)` e expõe os dois DAOs. O `companion object`, o campo `@Volatile` e `synchronized(this)` garantem o acesso a uma instância compartilhada do banco durante a execução do aplicativo.</w:t>
+        <w:t xml:space="preserve">A classe `AppDatabase` herda de `RoomDatabase`, declara `Categoria` e `Despesa` em `@Database(entities = [...], version = 1)` e expõe os dois DAOs. O `companion object`, o campo `@Volatile` e </w:t>
+      </w:r>
+      <w:r>
+        <w:t>`synchronized(this)` garantem o acesso a uma instância compartilhada do banco durante a execução do aplicativo.</w:t>
       </w:r>
     </w:p>
     <w:p>
@@ -2883,7 +2975,10 @@
     </w:p>
     <w:p>
       <w:r>
-        <w:t>A migração mantém os formulários e os botões existentes. A diferença está no destino de cada ação: em vez de mutar diretamente a lista como armazenamento definitivo, o app executa a operação no Room e sincroniza o estado observável que alimenta a interface.</w:t>
+        <w:t>A migração mantém os formulários e os botões existentes. A diferença está no destino de cada ação: em vez de mutar</w:t>
+      </w:r>
+      <w:r>
+        <w:t xml:space="preserve"> diretamente a lista como armazenamento definitivo, o app executa a operação no Room e sincroniza o estado observável que alimenta a interface.</w:t>
       </w:r>
     </w:p>
     <w:tbl>
@@ -3018,7 +3113,13 @@
               <w:rPr>
                 <w:sz w:val="18"/>
               </w:rPr>
-              <w:t>Ao abrir as listas de Categorias e Despesas, `LaunchedEffect(Unit)` chama `Dados.carregarTudo()`, que consulta os DAOs.</w:t>
+              <w:t xml:space="preserve">Ao abrir as listas de Categorias e Despesas, </w:t>
+            </w:r>
+            <w:r>
+              <w:rPr>
+                <w:sz w:val="18"/>
+              </w:rPr>
+              <w:t>`LaunchedEffect(Unit)` chama `Dados.carregarTudo()`, que consulta os DAOs.</w:t>
             </w:r>
           </w:p>
         </w:tc>
@@ -3140,7 +3241,13 @@
               <w:rPr>
                 <w:sz w:val="18"/>
               </w:rPr>
-              <w:t>Quando há um item em edição, o formulário envia a entidade com o ID existente. A camada de dados chama `atualizar(...)`.</w:t>
+              <w:t xml:space="preserve">Quando há um </w:t>
+            </w:r>
+            <w:r>
+              <w:rPr>
+                <w:sz w:val="18"/>
+              </w:rPr>
+              <w:t>item em edição, o formulário envia a entidade com o ID existente. A camada de dados chama `atualizar(...)`.</w:t>
             </w:r>
           </w:p>
         </w:tc>
@@ -3235,7 +3342,14 @@
                 <w:b/>
                 <w:sz w:val="18"/>
               </w:rPr>
-              <w:t>Tratar falhas</w:t>
+              <w:t>T</w:t>
+            </w:r>
+            <w:r>
+              <w:rPr>
+                <w:b/>
+                <w:sz w:val="18"/>
+              </w:rPr>
+              <w:t>ratar falhas</w:t>
             </w:r>
           </w:p>
         </w:tc>
@@ -3342,12 +3456,21 @@
         <w:rPr>
           <w:rFonts w:ascii="Carlito" w:eastAsia="Carlito" w:hAnsi="Carlito"/>
         </w:rPr>
-        <w:t>6.1 Consultas adicionais e detalhes por ID</w:t>
+        <w:t xml:space="preserve">6.1 </w:t>
+      </w:r>
+      <w:r>
+        <w:rPr>
+          <w:rFonts w:ascii="Carlito" w:eastAsia="Carlito" w:hAnsi="Carlito"/>
+        </w:rPr>
+        <w:t>Consultas adicionais e detalhes por ID</w:t>
       </w:r>
     </w:p>
     <w:p>
       <w:r>
-        <w:t>Além dos quatro métodos básicos, `CategoriaDao` e `DespesaDao` implementam `buscarPorId(id)`. O DAO de despesas também contém `buscarPorCategoria(categoriaId)`. Essas consultas resolvem necessidades concretas do fluxo de navegação e dos cálculos por categoria.</w:t>
+        <w:t>Além dos quatro métodos básicos, `CategoriaDao` e `DespesaDao` implementam `buscarPorId(id)`. O DAO de despesas também contém `buscarPorCategoria(categoriaId)`. Essas consultas resolvem necessidades concretas do fluxo</w:t>
+      </w:r>
+      <w:r>
+        <w:t xml:space="preserve"> de navegação e dos cálculos por categoria.</w:t>
       </w:r>
     </w:p>
     <w:p>
@@ -3428,7 +3551,15 @@
                 <w:color w:val="29443A"/>
                 <w:sz w:val="16"/>
               </w:rPr>
-              <w:t>@Query("SELECT * FROM despesas WHERE categoriaId = :categoriaId ORDER BY id DESC")</w:t>
+              <w:t xml:space="preserve">@Query("SELECT * FROM despesas WHERE categoriaId = :categoriaId ORDER BY </w:t>
+            </w:r>
+            <w:r>
+              <w:rPr>
+                <w:rFonts w:ascii="Liberation Mono" w:eastAsia="Liberation Mono" w:hAnsi="Liberation Mono"/>
+                <w:color w:val="29443A"/>
+                <w:sz w:val="16"/>
+              </w:rPr>
+              <w:t>id DESC")</w:t>
             </w:r>
             <w:r>
               <w:br/>
@@ -3452,7 +3583,10 @@
     </w:p>
     <w:p>
       <w:r>
-        <w:t>As telas de detalhes recebem o ID extraído da rota (`detalhes_categoria/{id}` ou `detalhes_despesa/{id}`) e consultam o banco por esse identificador, em vez de depender apenas de um objeto completo passado pela navegação.</w:t>
+        <w:t xml:space="preserve">As telas de detalhes recebem o ID extraído da rota (`detalhes_categoria/{id}` ou `detalhes_despesa/{id}`) e consultam o banco por esse identificador, em vez de depender </w:t>
+      </w:r>
+      <w:r>
+        <w:t>apenas de um objeto completo passado pela navegação.</w:t>
       </w:r>
     </w:p>
     <w:tbl>
@@ -3505,7 +3639,13 @@
               <w:rPr>
                 <w:sz w:val="19"/>
               </w:rPr>
-              <w:t>A implementação remove as despesas vinculadas antes de excluir a categoria. Isso evita que a aplicação mantenha despesas apontando para uma categoria que deixou de existir. Confirme se essa regra de negócio corresponde ao comportamento esperado pelo grupo.</w:t>
+              <w:t>A implementação remove as despesas vinculadas antes de excluir a categoria. Isso evita que a aplicação mantenha despesas apontando para uma categoria que deixou de exist</w:t>
+            </w:r>
+            <w:r>
+              <w:rPr>
+                <w:sz w:val="19"/>
+              </w:rPr>
+              <w:t>ir. Confirme se essa regra de negócio corresponde ao comportamento esperado pelo grupo.</w:t>
             </w:r>
           </w:p>
         </w:tc>
@@ -3529,7 +3669,10 @@
     </w:p>
     <w:p>
       <w:r>
-        <w:t>Continuam no projeto os componentes e fluxos trabalhados anteriormente, como Navigation/ NavHost, LazyColumn com Card, formulários, barra de navegação inferior e telas de detalhes. O objetivo do Trabalho 3 não é redesenhar o app, mas persistir suas operações.</w:t>
+        <w:t>Continuam no projeto os componentes e fluxos trabalhados anteriormente, como Navigation/ NavHost, LazyColumn com Card, formulári</w:t>
+      </w:r>
+      <w:r>
+        <w:t>os, barra de navegação inferior e telas de detalhes. O objetivo do Trabalho 3 não é redesenhar o app, mas persistir suas operações.</w:t>
       </w:r>
     </w:p>
     <w:p>
@@ -3562,7 +3705,10 @@
         <w:spacing w:after="60" w:line="264" w:lineRule="auto"/>
       </w:pPr>
       <w:r>
-        <w:t>Reaproveitar as classes `Categoria` e `Despesa` existentes e convertê-las em entidades Room, evitando duplicar modelos para o mesmo conceito.</w:t>
+        <w:t xml:space="preserve">Reaproveitar as classes `Categoria` e </w:t>
+      </w:r>
+      <w:r>
+        <w:t>`Despesa` existentes e convertê-las em entidades Room, evitando duplicar modelos para o mesmo conceito.</w:t>
       </w:r>
     </w:p>
     <w:p>
@@ -3580,7 +3726,10 @@
         <w:spacing w:after="60" w:line="264" w:lineRule="auto"/>
       </w:pPr>
       <w:r>
-        <w:t>Concentrar o acesso ao banco em `Dados.kt`, mantendo as chamadas das telas simples e uniformes.</w:t>
+        <w:t>Concentrar o acesso ao banco em `Dados.kt`, mantend</w:t>
+      </w:r>
+      <w:r>
+        <w:t>o as chamadas das telas simples e uniformes.</w:t>
       </w:r>
     </w:p>
     <w:p>
@@ -3598,7 +3747,10 @@
         <w:spacing w:after="60" w:line="264" w:lineRule="auto"/>
       </w:pPr>
       <w:r>
-        <w:t>Manter o banco local no dispositivo. A atividade não requer autenticação real, API remota, servidor ou sincronização em nuvem.</w:t>
+        <w:t>Manter o banco local no dispositivo. A atividade não requer autenticação real, API remota, servidor ou sin</w:t>
+      </w:r>
+      <w:r>
+        <w:t>cronização em nuvem.</w:t>
       </w:r>
     </w:p>
     <w:p>
@@ -3623,7 +3775,13 @@
     </w:p>
     <w:p>
       <w:r>
-        <w:t>A mudança conceitual mais importante é que uma lista em memória e um banco de dados têm ciclos de vida diferentes. No Trabalho 2, uma atribuição ou remoção na lista alterava imediatamente a interface, mas não criava um registro persistente. Com Room, a gravação é assíncrona: primeiro a operação é enviada ao DAO em uma coroutine; depois a camada de dados recarrega os registros para atualizar o estado observado pelo Compose.</w:t>
+        <w:t>A mudança conceitual mais importante é que uma lista</w:t>
+      </w:r>
+      <w:r>
+        <w:t xml:space="preserve"> em memória e um banco de dados têm ciclos de vida diferentes. No Trabalho 2, uma atribuição ou remoção na lista alterava imediatamente a interface, mas não criava um registro persistente. Com Room, a gravação é assíncrona: primeiro a operação é enviada ao</w:t>
+      </w:r>
+      <w:r>
+        <w:t xml:space="preserve"> DAO em uma coroutine; depois a camada de dados recarrega os registros para atualizar o estado observado pelo Compose.</w:t>
       </w:r>
     </w:p>
     <w:p>
@@ -3769,7 +3927,13 @@
               <w:rPr>
                 <w:sz w:val="18"/>
               </w:rPr>
-              <w:t>Executar operações de banco no `Dispatchers.IO`.</w:t>
+              <w:t>Executar operações de banco no `Dispatc</w:t>
+            </w:r>
+            <w:r>
+              <w:rPr>
+                <w:sz w:val="18"/>
+              </w:rPr>
+              <w:t>hers.IO`.</w:t>
             </w:r>
           </w:p>
         </w:tc>
@@ -3925,7 +4089,14 @@
                 <w:b/>
                 <w:sz w:val="18"/>
               </w:rPr>
-              <w:t>Localizar o registro na tela de detalhes</w:t>
+              <w:t xml:space="preserve">Localizar o </w:t>
+            </w:r>
+            <w:r>
+              <w:rPr>
+                <w:b/>
+                <w:sz w:val="18"/>
+              </w:rPr>
+              <w:t>registro na tela de detalhes</w:t>
             </w:r>
           </w:p>
         </w:tc>
@@ -4110,61 +4281,11 @@
           <w:lang w:val="pt-BR"/>
         </w:rPr>
       </w:pPr>
-      <w:proofErr w:type="spellStart"/>
       <w:r>
         <w:rPr>
           <w:sz w:val="18"/>
         </w:rPr>
-        <w:t>Dificuldade</w:t>
-      </w:r>
-      <w:proofErr w:type="spellEnd"/>
-      <w:r>
-        <w:rPr>
-          <w:sz w:val="18"/>
-        </w:rPr>
-        <w:t xml:space="preserve"> </w:t>
-      </w:r>
-      <w:proofErr w:type="spellStart"/>
-      <w:r>
-        <w:rPr>
-          <w:sz w:val="18"/>
-        </w:rPr>
-        <w:t>enfrentada</w:t>
-      </w:r>
-      <w:proofErr w:type="spellEnd"/>
-      <w:r>
-        <w:rPr>
-          <w:sz w:val="18"/>
-        </w:rPr>
-        <w:t xml:space="preserve"> </w:t>
-      </w:r>
-      <w:proofErr w:type="spellStart"/>
-      <w:r>
-        <w:rPr>
-          <w:sz w:val="18"/>
-        </w:rPr>
-        <w:t>pelo</w:t>
-      </w:r>
-      <w:proofErr w:type="spellEnd"/>
-      <w:r>
-        <w:rPr>
-          <w:sz w:val="18"/>
-        </w:rPr>
-        <w:t xml:space="preserve"> </w:t>
-      </w:r>
-      <w:proofErr w:type="spellStart"/>
-      <w:r>
-        <w:rPr>
-          <w:sz w:val="18"/>
-        </w:rPr>
-        <w:t>grupo</w:t>
-      </w:r>
-      <w:proofErr w:type="spellEnd"/>
-      <w:r>
-        <w:rPr>
-          <w:sz w:val="18"/>
-        </w:rPr>
-        <w:t xml:space="preserve">: </w:t>
+        <w:t xml:space="preserve">Dificuldade enfrentada pelo grupo: </w:t>
       </w:r>
       <w:r>
         <w:rPr>
@@ -4188,35 +4309,7 @@
         <w:rPr>
           <w:sz w:val="18"/>
         </w:rPr>
-        <w:t xml:space="preserve">Como </w:t>
-      </w:r>
-      <w:proofErr w:type="spellStart"/>
-      <w:r>
-        <w:rPr>
-          <w:sz w:val="18"/>
-        </w:rPr>
-        <w:t>investigamos</w:t>
-      </w:r>
-      <w:proofErr w:type="spellEnd"/>
-      <w:r>
-        <w:rPr>
-          <w:sz w:val="18"/>
-        </w:rPr>
-        <w:t xml:space="preserve"> e </w:t>
-      </w:r>
-      <w:proofErr w:type="spellStart"/>
-      <w:r>
-        <w:rPr>
-          <w:sz w:val="18"/>
-        </w:rPr>
-        <w:t>resolvemos</w:t>
-      </w:r>
-      <w:proofErr w:type="spellEnd"/>
-      <w:r>
-        <w:rPr>
-          <w:sz w:val="18"/>
-        </w:rPr>
-        <w:t xml:space="preserve">: </w:t>
+        <w:t xml:space="preserve">Como investigamos e resolvemos: </w:t>
       </w:r>
       <w:r>
         <w:rPr>
@@ -4224,25 +4317,7 @@
           <w:szCs w:val="16"/>
           <w:lang w:val="pt-BR"/>
         </w:rPr>
-        <w:t xml:space="preserve">Analisamos a estrutura do projeto e identificamos os pontos que precisavam ser adaptados para utilizar o Room. Ajustamos as entidades, criamos os </w:t>
-      </w:r>
-      <w:proofErr w:type="spellStart"/>
-      <w:r>
-        <w:rPr>
-          <w:sz w:val="16"/>
-          <w:szCs w:val="16"/>
-          <w:lang w:val="pt-BR"/>
-        </w:rPr>
-        <w:t>DAOs</w:t>
-      </w:r>
-      <w:proofErr w:type="spellEnd"/>
-      <w:r>
-        <w:rPr>
-          <w:sz w:val="16"/>
-          <w:szCs w:val="16"/>
-          <w:lang w:val="pt-BR"/>
-        </w:rPr>
-        <w:t xml:space="preserve"> e o banco de dados, e adaptamos as operações de cadastro, edição e exclusão para utilizar o banco local. Também organizamos as chamadas assíncronas para evitar o bloqueio da interface.</w:t>
+        <w:t>Analisamos a estrutura do projeto e identificamos os pontos que precisavam ser adaptados para utilizar o Room. Ajustamos as entidades, criamos os DAOs e o banco de dados, e adaptamos as operações de cadastro, edição e exclusão para utilizar o banco local. Também organizamos as chamadas assíncronas para evitar o bloqueio da interface.</w:t>
       </w:r>
     </w:p>
     <w:p>
@@ -4254,47 +4329,11 @@
           <w:lang w:val="pt-BR"/>
         </w:rPr>
       </w:pPr>
-      <w:proofErr w:type="spellStart"/>
       <w:r>
         <w:rPr>
           <w:sz w:val="18"/>
         </w:rPr>
-        <w:t>Integrante</w:t>
-      </w:r>
-      <w:proofErr w:type="spellEnd"/>
-      <w:r>
-        <w:rPr>
-          <w:sz w:val="18"/>
-        </w:rPr>
-        <w:t xml:space="preserve">(s) </w:t>
-      </w:r>
-      <w:proofErr w:type="spellStart"/>
-      <w:r>
-        <w:rPr>
-          <w:sz w:val="18"/>
-        </w:rPr>
-        <w:t>envolvido</w:t>
-      </w:r>
-      <w:proofErr w:type="spellEnd"/>
-      <w:r>
-        <w:rPr>
-          <w:sz w:val="18"/>
-        </w:rPr>
-        <w:t xml:space="preserve">(s) e </w:t>
-      </w:r>
-      <w:proofErr w:type="spellStart"/>
-      <w:r>
-        <w:rPr>
-          <w:sz w:val="18"/>
-        </w:rPr>
-        <w:t>contribuição</w:t>
-      </w:r>
-      <w:proofErr w:type="spellEnd"/>
-      <w:r>
-        <w:rPr>
-          <w:sz w:val="18"/>
-        </w:rPr>
-        <w:t xml:space="preserve">: </w:t>
+        <w:t xml:space="preserve">Integrante(s) envolvido(s) e contribuição: </w:t>
       </w:r>
       <w:r>
         <w:rPr>
@@ -4314,61 +4353,17 @@
           <w:lang w:val="pt-BR"/>
         </w:rPr>
       </w:pPr>
-      <w:proofErr w:type="spellStart"/>
       <w:r>
         <w:rPr>
           <w:sz w:val="18"/>
         </w:rPr>
-        <w:t>Ajustes</w:t>
+        <w:t>Ajustes que ainda foram n</w:t>
       </w:r>
-      <w:proofErr w:type="spellEnd"/>
       <w:r>
         <w:rPr>
           <w:sz w:val="18"/>
         </w:rPr>
-        <w:t xml:space="preserve"> </w:t>
-      </w:r>
-      <w:proofErr w:type="spellStart"/>
-      <w:r>
-        <w:rPr>
-          <w:sz w:val="18"/>
-        </w:rPr>
-        <w:t>que</w:t>
-      </w:r>
-      <w:proofErr w:type="spellEnd"/>
-      <w:r>
-        <w:rPr>
-          <w:sz w:val="18"/>
-        </w:rPr>
-        <w:t xml:space="preserve"> </w:t>
-      </w:r>
-      <w:proofErr w:type="spellStart"/>
-      <w:r>
-        <w:rPr>
-          <w:sz w:val="18"/>
-        </w:rPr>
-        <w:t>ainda</w:t>
-      </w:r>
-      <w:proofErr w:type="spellEnd"/>
-      <w:r>
-        <w:rPr>
-          <w:sz w:val="18"/>
-        </w:rPr>
-        <w:t xml:space="preserve"> </w:t>
-      </w:r>
-      <w:proofErr w:type="spellStart"/>
-      <w:r>
-        <w:rPr>
-          <w:sz w:val="18"/>
-        </w:rPr>
-        <w:t>foram</w:t>
-      </w:r>
-      <w:proofErr w:type="spellEnd"/>
-      <w:r>
-        <w:rPr>
-          <w:sz w:val="18"/>
-        </w:rPr>
-        <w:t xml:space="preserve"> necessários no Android Studio/emulador: </w:t>
+        <w:t xml:space="preserve">ecessários no Android Studio/emulador: </w:t>
       </w:r>
       <w:r>
         <w:rPr>
@@ -4376,25 +4371,7 @@
           <w:szCs w:val="16"/>
           <w:lang w:val="pt-BR"/>
         </w:rPr>
-        <w:t xml:space="preserve">É necessário sincronizar o </w:t>
-      </w:r>
-      <w:proofErr w:type="spellStart"/>
-      <w:r>
-        <w:rPr>
-          <w:sz w:val="16"/>
-          <w:szCs w:val="16"/>
-          <w:lang w:val="pt-BR"/>
-        </w:rPr>
-        <w:t>Gradle</w:t>
-      </w:r>
-      <w:proofErr w:type="spellEnd"/>
-      <w:r>
-        <w:rPr>
-          <w:sz w:val="16"/>
-          <w:szCs w:val="16"/>
-          <w:lang w:val="pt-BR"/>
-        </w:rPr>
-        <w:t>, verificar se o projeto compila corretamente e executar os testes no emulador. Também é necessário validar as operações de cadastro, edição e exclusão, além de fechar e reabrir o aplicativo para confirmar que os dados permanecem salvos no banco local.</w:t>
+        <w:t>É necessário sincronizar o Gradle, verificar se o projeto compila corretamente e executar os testes no emulador. Também é necessário validar as operações de cadastro, edição e exclusão, além de fechar e reabrir o aplicativo para confirmar que os dados permanecem salvos no banco local.</w:t>
       </w:r>
     </w:p>
     <w:p>
@@ -4417,7 +4394,7 @@
     </w:p>
     <w:p>
       <w:r>
-        <w:t>A rubrica enfatiza a demonstração do aplicativo em execução. O texto deste relatório não substitui capturas de tela nem vídeos. Substituam os quadros abaixo por prints reais do emulador/aparelho ou adicionem links acessíveis aos vídeos armazenados no repositório.</w:t>
+        <w:t>Video está junto com o codigo.</w:t>
       </w:r>
     </w:p>
     <w:tbl>
@@ -4470,7 +4447,13 @@
               <w:rPr>
                 <w:sz w:val="19"/>
               </w:rPr>
-              <w:t>O vídeo deve mostrar a criação de um registro, o encerramento completo do aplicativo, a reabertura e a localização do mesmo registro com seus dados preservados. Apenas voltar à tela inicial ou sair da tela de cadastro não comprova o teste de persistência.</w:t>
+              <w:t>O vídeo deve mostrar a criação de um registro, o encerramento completo do aplicativo, a reabertura e a localizaç</w:t>
+            </w:r>
+            <w:r>
+              <w:rPr>
+                <w:sz w:val="19"/>
+              </w:rPr>
+              <w:t>ão do mesmo registro com seus dados preservados. Apenas voltar à tela inicial ou sair da tela de cadastro não comprova o teste de persistência.</w:t>
             </w:r>
           </w:p>
         </w:tc>
@@ -4512,58 +4495,82 @@
             </w:tcMar>
           </w:tcPr>
           <w:p>
-            <w:pPr>
-              <w:jc w:val="center"/>
-            </w:pPr>
-            <w:r>
-              <w:rPr>
-                <w:b/>
-                <w:color w:val="18745B"/>
-              </w:rPr>
-              <w:t>Evidência A — Cadastro e edição</w:t>
-            </w:r>
-          </w:p>
-          <w:p>
-            <w:pPr>
-              <w:spacing w:after="40"/>
-              <w:jc w:val="center"/>
-            </w:pPr>
-            <w:r>
-              <w:rPr>
-                <w:b/>
-                <w:color w:val="61736C"/>
-                <w:sz w:val="18"/>
-              </w:rPr>
-              <w:t>[INSERIR PRINT OU LINK PARA VÍDEO REAL]</w:t>
-            </w:r>
-          </w:p>
-          <w:p>
-            <w:pPr>
-              <w:spacing w:after="40"/>
-              <w:jc w:val="center"/>
-            </w:pPr>
-            <w:r>
-              <w:rPr>
-                <w:i/>
-                <w:color w:val="61736C"/>
-                <w:sz w:val="17"/>
-              </w:rPr>
-              <w:t>Mostrar um item sendo criado e depois editado. Inserir a captura real ou link do vídeo.</w:t>
-            </w:r>
-          </w:p>
-          <w:p>
-            <w:r>
-              <w:t xml:space="preserve"> </w:t>
-            </w:r>
-          </w:p>
-          <w:p>
-            <w:r>
-              <w:t xml:space="preserve"> </w:t>
-            </w:r>
-          </w:p>
-          <w:p>
-            <w:r>
-              <w:t xml:space="preserve"> </w:t>
+            <w:r>
+              <w:drawing>
+                <wp:inline distT="0" distB="0" distL="0" distR="0" wp14:anchorId="4C9640CF" wp14:editId="4E8E0597">
+                  <wp:extent cx="2382640" cy="5305425"/>
+                  <wp:effectExtent l="0" t="0" r="0" b="0"/>
+                  <wp:docPr id="3" name="Imagem 3"/>
+                  <wp:cNvGraphicFramePr>
+                    <a:graphicFrameLocks xmlns:a="http://schemas.openxmlformats.org/drawingml/2006/main" noChangeAspect="1"/>
+                  </wp:cNvGraphicFramePr>
+                  <a:graphic xmlns:a="http://schemas.openxmlformats.org/drawingml/2006/main">
+                    <a:graphicData uri="http://schemas.openxmlformats.org/drawingml/2006/picture">
+                      <pic:pic xmlns:pic="http://schemas.openxmlformats.org/drawingml/2006/picture">
+                        <pic:nvPicPr>
+                          <pic:cNvPr id="1" name=""/>
+                          <pic:cNvPicPr/>
+                        </pic:nvPicPr>
+                        <pic:blipFill>
+                          <a:blip r:embed="rId10"/>
+                          <a:stretch>
+                            <a:fillRect/>
+                          </a:stretch>
+                        </pic:blipFill>
+                        <pic:spPr>
+                          <a:xfrm>
+                            <a:off x="0" y="0"/>
+                            <a:ext cx="2385777" cy="5312411"/>
+                          </a:xfrm>
+                          <a:prstGeom prst="rect">
+                            <a:avLst/>
+                          </a:prstGeom>
+                        </pic:spPr>
+                      </pic:pic>
+                    </a:graphicData>
+                  </a:graphic>
+                </wp:inline>
+              </w:drawing>
+            </w:r>
+            <w:r>
+              <w:t xml:space="preserve">                                    </w:t>
+            </w:r>
+            <w:r>
+              <w:drawing>
+                <wp:inline distT="0" distB="0" distL="0" distR="0" wp14:anchorId="4A4013ED" wp14:editId="5A5D06F6">
+                  <wp:extent cx="2371725" cy="5306435"/>
+                  <wp:effectExtent l="0" t="0" r="0" b="8890"/>
+                  <wp:docPr id="4" name="Imagem 4"/>
+                  <wp:cNvGraphicFramePr>
+                    <a:graphicFrameLocks xmlns:a="http://schemas.openxmlformats.org/drawingml/2006/main" noChangeAspect="1"/>
+                  </wp:cNvGraphicFramePr>
+                  <a:graphic xmlns:a="http://schemas.openxmlformats.org/drawingml/2006/main">
+                    <a:graphicData uri="http://schemas.openxmlformats.org/drawingml/2006/picture">
+                      <pic:pic xmlns:pic="http://schemas.openxmlformats.org/drawingml/2006/picture">
+                        <pic:nvPicPr>
+                          <pic:cNvPr id="1" name=""/>
+                          <pic:cNvPicPr/>
+                        </pic:nvPicPr>
+                        <pic:blipFill>
+                          <a:blip r:embed="rId11"/>
+                          <a:stretch>
+                            <a:fillRect/>
+                          </a:stretch>
+                        </pic:blipFill>
+                        <pic:spPr>
+                          <a:xfrm>
+                            <a:off x="0" y="0"/>
+                            <a:ext cx="2385535" cy="5337332"/>
+                          </a:xfrm>
+                          <a:prstGeom prst="rect">
+                            <a:avLst/>
+                          </a:prstGeom>
+                        </pic:spPr>
+                      </pic:pic>
+                    </a:graphicData>
+                  </a:graphic>
+                </wp:inline>
+              </w:drawing>
             </w:r>
           </w:p>
         </w:tc>
@@ -4573,204 +4580,6 @@
       <w:pPr>
         <w:spacing w:after="20"/>
       </w:pPr>
-    </w:p>
-    <w:tbl>
-      <w:tblPr>
-        <w:tblW w:w="0" w:type="auto"/>
-        <w:jc w:val="center"/>
-        <w:tblLook w:val="04A0" w:firstRow="1" w:lastRow="0" w:firstColumn="1" w:lastColumn="0" w:noHBand="0" w:noVBand="1"/>
-      </w:tblPr>
-      <w:tblGrid>
-        <w:gridCol w:w="9663"/>
-      </w:tblGrid>
-      <w:tr>
-        <w:trPr>
-          <w:jc w:val="center"/>
-        </w:trPr>
-        <w:tc>
-          <w:tcPr>
-            <w:tcW w:w="9663" w:type="dxa"/>
-            <w:tcBorders>
-              <w:top w:val="dashed" w:sz="8" w:space="0" w:color="A5B7AE"/>
-              <w:left w:val="dashed" w:sz="8" w:space="0" w:color="A5B7AE"/>
-              <w:bottom w:val="dashed" w:sz="8" w:space="0" w:color="A5B7AE"/>
-              <w:right w:val="dashed" w:sz="8" w:space="0" w:color="A5B7AE"/>
-            </w:tcBorders>
-            <w:shd w:val="clear" w:color="auto" w:fill="FBFCFB"/>
-            <w:tcMar>
-              <w:top w:w="120" w:type="dxa"/>
-              <w:left w:w="160" w:type="dxa"/>
-              <w:bottom w:w="120" w:type="dxa"/>
-              <w:right w:w="160" w:type="dxa"/>
-            </w:tcMar>
-          </w:tcPr>
-          <w:p>
-            <w:pPr>
-              <w:jc w:val="center"/>
-            </w:pPr>
-            <w:r>
-              <w:rPr>
-                <w:b/>
-                <w:color w:val="18745B"/>
-              </w:rPr>
-              <w:t>Evidência B — Exclusão</w:t>
-            </w:r>
-          </w:p>
-          <w:p>
-            <w:pPr>
-              <w:spacing w:after="40"/>
-              <w:jc w:val="center"/>
-            </w:pPr>
-            <w:r>
-              <w:rPr>
-                <w:b/>
-                <w:color w:val="61736C"/>
-                <w:sz w:val="18"/>
-              </w:rPr>
-              <w:t>[INSERIR PRINT OU LINK PARA VÍDEO REAL]</w:t>
-            </w:r>
-          </w:p>
-          <w:p>
-            <w:pPr>
-              <w:spacing w:after="40"/>
-              <w:jc w:val="center"/>
-            </w:pPr>
-            <w:r>
-              <w:rPr>
-                <w:i/>
-                <w:color w:val="61736C"/>
-                <w:sz w:val="17"/>
-              </w:rPr>
-              <w:t>Mostrar o item sendo removido da lista. Inserir a captura real ou link do vídeo.</w:t>
-            </w:r>
-          </w:p>
-          <w:p>
-            <w:r>
-              <w:t xml:space="preserve"> </w:t>
-            </w:r>
-          </w:p>
-          <w:p>
-            <w:r>
-              <w:t xml:space="preserve"> </w:t>
-            </w:r>
-          </w:p>
-          <w:p>
-            <w:r>
-              <w:t xml:space="preserve"> </w:t>
-            </w:r>
-          </w:p>
-        </w:tc>
-      </w:tr>
-    </w:tbl>
-    <w:p>
-      <w:pPr>
-        <w:spacing w:after="20"/>
-      </w:pPr>
-    </w:p>
-    <w:tbl>
-      <w:tblPr>
-        <w:tblW w:w="0" w:type="auto"/>
-        <w:jc w:val="center"/>
-        <w:tblLook w:val="04A0" w:firstRow="1" w:lastRow="0" w:firstColumn="1" w:lastColumn="0" w:noHBand="0" w:noVBand="1"/>
-      </w:tblPr>
-      <w:tblGrid>
-        <w:gridCol w:w="9663"/>
-      </w:tblGrid>
-      <w:tr>
-        <w:trPr>
-          <w:jc w:val="center"/>
-        </w:trPr>
-        <w:tc>
-          <w:tcPr>
-            <w:tcW w:w="9663" w:type="dxa"/>
-            <w:tcBorders>
-              <w:top w:val="dashed" w:sz="8" w:space="0" w:color="A5B7AE"/>
-              <w:left w:val="dashed" w:sz="8" w:space="0" w:color="A5B7AE"/>
-              <w:bottom w:val="dashed" w:sz="8" w:space="0" w:color="A5B7AE"/>
-              <w:right w:val="dashed" w:sz="8" w:space="0" w:color="A5B7AE"/>
-            </w:tcBorders>
-            <w:shd w:val="clear" w:color="auto" w:fill="FBFCFB"/>
-            <w:tcMar>
-              <w:top w:w="120" w:type="dxa"/>
-              <w:left w:w="160" w:type="dxa"/>
-              <w:bottom w:w="120" w:type="dxa"/>
-              <w:right w:w="160" w:type="dxa"/>
-            </w:tcMar>
-          </w:tcPr>
-          <w:p>
-            <w:pPr>
-              <w:jc w:val="center"/>
-            </w:pPr>
-            <w:r>
-              <w:rPr>
-                <w:b/>
-                <w:color w:val="18745B"/>
-              </w:rPr>
-              <w:t>Evidência C — Fechar e reabrir</w:t>
-            </w:r>
-          </w:p>
-          <w:p>
-            <w:pPr>
-              <w:spacing w:after="40"/>
-              <w:jc w:val="center"/>
-            </w:pPr>
-            <w:r>
-              <w:rPr>
-                <w:b/>
-                <w:color w:val="61736C"/>
-                <w:sz w:val="18"/>
-              </w:rPr>
-              <w:t>[INSERIR PRINT OU LINK PARA VÍDEO REAL]</w:t>
-            </w:r>
-          </w:p>
-          <w:p>
-            <w:pPr>
-              <w:spacing w:after="40"/>
-              <w:jc w:val="center"/>
-            </w:pPr>
-            <w:r>
-              <w:rPr>
-                <w:i/>
-                <w:color w:val="61736C"/>
-                <w:sz w:val="17"/>
-              </w:rPr>
-              <w:t>Mostrar o item antes e depois de encerrar completamente e reabrir o Contaê.</w:t>
-            </w:r>
-          </w:p>
-          <w:p>
-            <w:r>
-              <w:t xml:space="preserve"> </w:t>
-            </w:r>
-          </w:p>
-          <w:p>
-            <w:r>
-              <w:t xml:space="preserve"> </w:t>
-            </w:r>
-          </w:p>
-          <w:p>
-            <w:r>
-              <w:t xml:space="preserve"> </w:t>
-            </w:r>
-          </w:p>
-        </w:tc>
-      </w:tr>
-    </w:tbl>
-    <w:p>
-      <w:pPr>
-        <w:spacing w:after="20"/>
-      </w:pPr>
-    </w:p>
-    <w:p>
-      <w:pPr>
-        <w:spacing w:after="40"/>
-      </w:pPr>
-      <w:r>
-        <w:rPr>
-          <w:color w:val="61736C"/>
-          <w:sz w:val="18"/>
-        </w:rPr>
-        <w:t>Local sugerido no repositório: `docs/evidencias/`. Nomeie os arquivos de forma clara, por exemplo `crud-categoria.mp4`, `crud-despesa.mp4`, `persistencia-fechar-reabrir.mp4` e `detalhes-por-id.png`.</w:t>
-      </w:r>
     </w:p>
     <w:p>
       <w:pPr>
@@ -4831,7 +4640,13 @@
         <w:rPr>
           <w:sz w:val="20"/>
         </w:rPr>
-        <w:t>Editar a categoria, salvar e confirmar os novos valores na lista.</w:t>
+        <w:t xml:space="preserve">Editar a </w:t>
+      </w:r>
+      <w:r>
+        <w:rPr>
+          <w:sz w:val="20"/>
+        </w:rPr>
+        <w:t>categoria, salvar e confirmar os novos valores na lista.</w:t>
       </w:r>
     </w:p>
     <w:p>
@@ -4888,7 +4703,13 @@
         <w:rPr>
           <w:sz w:val="20"/>
         </w:rPr>
-        <w:t>Editar a despesa, salvar e confirmar os dados alterados.</w:t>
+        <w:t xml:space="preserve">Editar a despesa, salvar e confirmar os dados </w:t>
+      </w:r>
+      <w:r>
+        <w:rPr>
+          <w:sz w:val="20"/>
+        </w:rPr>
+        <w:t>alterados.</w:t>
       </w:r>
     </w:p>
     <w:p>
@@ -4945,7 +4766,13 @@
         <w:rPr>
           <w:sz w:val="20"/>
         </w:rPr>
-        <w:t>Gravar o fluxo real em vídeo e adicionar as evidências ao documento e repositório.</w:t>
+        <w:t>Gravar o fluxo real em vídeo e adicionar as evidências ao documento e repositóri</w:t>
+      </w:r>
+      <w:r>
+        <w:rPr>
+          <w:sz w:val="20"/>
+        </w:rPr>
+        <w:t>o.</w:t>
       </w:r>
     </w:p>
     <w:p>
@@ -5064,7 +4891,14 @@
                 <w:b/>
                 <w:sz w:val="16"/>
               </w:rPr>
-              <w:t>☐ Dependências</w:t>
+              <w:t>☐</w:t>
+            </w:r>
+            <w:r>
+              <w:rPr>
+                <w:b/>
+                <w:sz w:val="16"/>
+              </w:rPr>
+              <w:t xml:space="preserve"> Dependências</w:t>
             </w:r>
           </w:p>
         </w:tc>
@@ -5125,7 +4959,14 @@
                 <w:b/>
                 <w:sz w:val="16"/>
               </w:rPr>
-              <w:t>☐ Entidades</w:t>
+              <w:t>☐</w:t>
+            </w:r>
+            <w:r>
+              <w:rPr>
+                <w:b/>
+                <w:sz w:val="16"/>
+              </w:rPr>
+              <w:t xml:space="preserve"> Entidades</w:t>
             </w:r>
           </w:p>
         </w:tc>
@@ -5186,7 +5027,14 @@
                 <w:b/>
                 <w:sz w:val="16"/>
               </w:rPr>
-              <w:t>☐ DAOs e queries</w:t>
+              <w:t>☐</w:t>
+            </w:r>
+            <w:r>
+              <w:rPr>
+                <w:b/>
+                <w:sz w:val="16"/>
+              </w:rPr>
+              <w:t xml:space="preserve"> DAOs e queries</w:t>
             </w:r>
           </w:p>
         </w:tc>
@@ -5247,7 +5095,14 @@
                 <w:b/>
                 <w:sz w:val="16"/>
               </w:rPr>
-              <w:t>☐ AppDatabase</w:t>
+              <w:t>☐</w:t>
+            </w:r>
+            <w:r>
+              <w:rPr>
+                <w:b/>
+                <w:sz w:val="16"/>
+              </w:rPr>
+              <w:t xml:space="preserve"> AppDatabase</w:t>
             </w:r>
           </w:p>
         </w:tc>
@@ -5308,7 +5163,14 @@
                 <w:b/>
                 <w:sz w:val="16"/>
               </w:rPr>
-              <w:t>☐ IO e erros</w:t>
+              <w:t>☐</w:t>
+            </w:r>
+            <w:r>
+              <w:rPr>
+                <w:b/>
+                <w:sz w:val="16"/>
+              </w:rPr>
+              <w:t xml:space="preserve"> IO e erros</w:t>
             </w:r>
           </w:p>
         </w:tc>
@@ -5369,7 +5231,21 @@
                 <w:b/>
                 <w:sz w:val="16"/>
               </w:rPr>
-              <w:t>☐ Listas e CRUD</w:t>
+              <w:t>☐</w:t>
+            </w:r>
+            <w:r>
+              <w:rPr>
+                <w:b/>
+                <w:sz w:val="16"/>
+              </w:rPr>
+              <w:t xml:space="preserve"> </w:t>
+            </w:r>
+            <w:r>
+              <w:rPr>
+                <w:b/>
+                <w:sz w:val="16"/>
+              </w:rPr>
+              <w:t>Listas e CRUD</w:t>
             </w:r>
           </w:p>
         </w:tc>
@@ -5430,7 +5306,14 @@
                 <w:b/>
                 <w:sz w:val="16"/>
               </w:rPr>
-              <w:t>☐ Detalhes por ID</w:t>
+              <w:t>☐</w:t>
+            </w:r>
+            <w:r>
+              <w:rPr>
+                <w:b/>
+                <w:sz w:val="16"/>
+              </w:rPr>
+              <w:t xml:space="preserve"> Detalhes por ID</w:t>
             </w:r>
           </w:p>
         </w:tc>
@@ -5491,7 +5374,14 @@
                 <w:b/>
                 <w:sz w:val="16"/>
               </w:rPr>
-              <w:t>☐ Persistência e docs</w:t>
+              <w:t>☐</w:t>
+            </w:r>
+            <w:r>
+              <w:rPr>
+                <w:b/>
+                <w:sz w:val="16"/>
+              </w:rPr>
+              <w:t xml:space="preserve"> Persistência e docs</w:t>
             </w:r>
           </w:p>
         </w:tc>
@@ -5518,7 +5408,13 @@
               <w:rPr>
                 <w:sz w:val="16"/>
               </w:rPr>
-              <w:t>Teste após fechar/reabrir; README, reflexão, prints e vídeos reais incluídos.</w:t>
+              <w:t>Teste após fechar/reabrir; README, reflexão, prints e vídeos reais inc</w:t>
+            </w:r>
+            <w:r>
+              <w:rPr>
+                <w:sz w:val="16"/>
+              </w:rPr>
+              <w:t>luídos.</w:t>
             </w:r>
           </w:p>
         </w:tc>
@@ -5594,7 +5490,13 @@
         <w:rPr>
           <w:sz w:val="18"/>
         </w:rPr>
-        <w:t>Como teste extra, executar `gradlew.bat assembleDebug` (Windows) ou `./gradlew assembleDebug` (macOS/Linux).</w:t>
+        <w:t xml:space="preserve">Como teste extra, executar </w:t>
+      </w:r>
+      <w:r>
+        <w:rPr>
+          <w:sz w:val="18"/>
+        </w:rPr>
+        <w:t>`gradlew.bat assembleDebug` (Windows) ou `./gradlew assembleDebug` (macOS/Linux).</w:t>
       </w:r>
     </w:p>
     <w:p>
@@ -5629,12 +5531,15 @@
     </w:p>
     <w:p>
       <w:r>
-        <w:t>O escopo usa Room/SQLite local, sem backend, API, autenticação real, sincronização entre dispositivos ou nuvem. O foco é persistir o CRUD do app existente, sem arquitetura avançada.</w:t>
+        <w:t xml:space="preserve">O escopo usa Room/SQLite local, sem backend, API, autenticação real, </w:t>
+      </w:r>
+      <w:r>
+        <w:t>sincronização entre dispositivos ou nuvem. O foco é persistir o CRUD do app existente, sem arquitetura avançada.</w:t>
       </w:r>
     </w:p>
     <w:sectPr>
-      <w:headerReference w:type="default" r:id="rId10"/>
-      <w:footerReference w:type="default" r:id="rId11"/>
+      <w:headerReference w:type="default" r:id="rId12"/>
+      <w:footerReference w:type="default" r:id="rId13"/>
       <w:pgSz w:w="11909" w:h="16834"/>
       <w:pgMar w:top="979" w:right="1123" w:bottom="936" w:left="1123" w:header="461" w:footer="461" w:gutter="0"/>
       <w:cols w:space="720"/>
@@ -5645,7 +5550,7 @@
 </file>
 
 <file path=word/endnotes.xml><?xml version="1.0" encoding="utf-8"?>
-<w:endnotes xmlns:wpc="http://schemas.microsoft.com/office/word/2010/wordprocessingCanvas" xmlns:cx="http://schemas.microsoft.com/office/drawing/2014/chartex" xmlns:cx1="http://schemas.microsoft.com/office/drawing/2015/9/8/chartex" xmlns:cx2="http://schemas.microsoft.com/office/drawing/2015/10/21/chartex" xmlns:cx3="http://schemas.microsoft.com/office/drawing/2016/5/9/chartex" xmlns:cx4="http://schemas.microsoft.com/office/drawing/2016/5/10/chartex" xmlns:cx5="http://schemas.microsoft.com/office/drawing/2016/5/11/chartex" xmlns:cx6="http://schemas.microsoft.com/office/drawing/2016/5/12/chartex" xmlns:cx7="http://schemas.microsoft.com/office/drawing/2016/5/13/chartex" xmlns:cx8="http://schemas.microsoft.com/office/drawing/2016/5/14/chartex" xmlns:mc="http://schemas.openxmlformats.org/markup-compatibility/2006" xmlns:aink="http://schemas.microsoft.com/office/drawing/2016/ink" xmlns:am3d="http://schemas.microsoft.com/office/drawing/2017/model3d" xmlns:o="urn:schemas-microsoft-com:office:office" xmlns:oel="http://schemas.microsoft.com/office/2019/extlst" xmlns:r="http://schemas.openxmlformats.org/officeDocument/2006/relationships" xmlns:m="http://schemas.openxmlformats.org/officeDocument/2006/math" xmlns:v="urn:schemas-microsoft-com:vml" xmlns:wp14="http://schemas.microsoft.com/office/word/2010/wordprocessingDrawing" xmlns:wp="http://schemas.openxmlformats.org/drawingml/2006/wordprocessingDrawing" xmlns:w10="urn:schemas-microsoft-com:office:word" xmlns:w="http://schemas.openxmlformats.org/wordprocessingml/2006/main" xmlns:w14="http://schemas.microsoft.com/office/word/2010/wordml" xmlns:w15="http://schemas.microsoft.com/office/word/2012/wordml" xmlns:w16cex="http://schemas.microsoft.com/office/word/2018/wordml/cex" xmlns:w16cid="http://schemas.microsoft.com/office/word/2016/wordml/cid" xmlns:w16="http://schemas.microsoft.com/office/word/2018/wordml" xmlns:w16du="http://schemas.microsoft.com/office/word/2023/wordml/word16du" xmlns:w16sdtdh="http://schemas.microsoft.com/office/word/2020/wordml/sdtdatahash" xmlns:w16sdtfl="http://schemas.microsoft.com/office/word/2024/wordml/sdtformatlock" xmlns:w16se="http://schemas.microsoft.com/office/word/2015/wordml/symex" xmlns:wpg="http://schemas.microsoft.com/office/word/2010/wordprocessingGroup" xmlns:wpi="http://schemas.microsoft.com/office/word/2010/wordprocessingInk" xmlns:wne="http://schemas.microsoft.com/office/word/2006/wordml" xmlns:wps="http://schemas.microsoft.com/office/word/2010/wordprocessingShape" mc:Ignorable="w14 w15 w16se w16cid w16 w16cex w16sdtdh w16sdtfl w16du wp14">
+<w:endnotes xmlns:wpc="http://schemas.microsoft.com/office/word/2010/wordprocessingCanvas" xmlns:cx="http://schemas.microsoft.com/office/drawing/2014/chartex" xmlns:cx1="http://schemas.microsoft.com/office/drawing/2015/9/8/chartex" xmlns:cx2="http://schemas.microsoft.com/office/drawing/2015/10/21/chartex" xmlns:cx3="http://schemas.microsoft.com/office/drawing/2016/5/9/chartex" xmlns:cx4="http://schemas.microsoft.com/office/drawing/2016/5/10/chartex" xmlns:cx5="http://schemas.microsoft.com/office/drawing/2016/5/11/chartex" xmlns:cx6="http://schemas.microsoft.com/office/drawing/2016/5/12/chartex" xmlns:cx7="http://schemas.microsoft.com/office/drawing/2016/5/13/chartex" xmlns:cx8="http://schemas.microsoft.com/office/drawing/2016/5/14/chartex" xmlns:mc="http://schemas.openxmlformats.org/markup-compatibility/2006" xmlns:aink="http://schemas.microsoft.com/office/drawing/2016/ink" xmlns:am3d="http://schemas.microsoft.com/office/drawing/2017/model3d" xmlns:o="urn:schemas-microsoft-com:office:office" xmlns:r="http://schemas.openxmlformats.org/officeDocument/2006/relationships" xmlns:m="http://schemas.openxmlformats.org/officeDocument/2006/math" xmlns:v="urn:schemas-microsoft-com:vml" xmlns:wp14="http://schemas.microsoft.com/office/word/2010/wordprocessingDrawing" xmlns:wp="http://schemas.openxmlformats.org/drawingml/2006/wordprocessingDrawing" xmlns:w10="urn:schemas-microsoft-com:office:word" xmlns:w="http://schemas.openxmlformats.org/wordprocessingml/2006/main" xmlns:w14="http://schemas.microsoft.com/office/word/2010/wordml" xmlns:w15="http://schemas.microsoft.com/office/word/2012/wordml" xmlns:w16cex="http://schemas.microsoft.com/office/word/2018/wordml/cex" xmlns:w16cid="http://schemas.microsoft.com/office/word/2016/wordml/cid" xmlns:w16="http://schemas.microsoft.com/office/word/2018/wordml" xmlns:w16sdtdh="http://schemas.microsoft.com/office/word/2020/wordml/sdtdatahash" xmlns:w16se="http://schemas.microsoft.com/office/word/2015/wordml/symex" xmlns:wpg="http://schemas.microsoft.com/office/word/2010/wordprocessingGroup" xmlns:wpi="http://schemas.microsoft.com/office/word/2010/wordprocessingInk" xmlns:wne="http://schemas.microsoft.com/office/word/2006/wordml" xmlns:wps="http://schemas.microsoft.com/office/word/2010/wordprocessingShape" mc:Ignorable="w14 w15 w16se w16cid w16 w16cex w16sdtdh wp14">
   <w:endnote w:type="separator" w:id="-1">
     <w:p>
       <w:pPr>
@@ -5670,7 +5575,7 @@
 </file>
 
 <file path=word/footer1.xml><?xml version="1.0" encoding="utf-8"?>
-<w:ftr xmlns:wpc="http://schemas.microsoft.com/office/word/2010/wordprocessingCanvas" xmlns:cx="http://schemas.microsoft.com/office/drawing/2014/chartex" xmlns:cx1="http://schemas.microsoft.com/office/drawing/2015/9/8/chartex" xmlns:cx2="http://schemas.microsoft.com/office/drawing/2015/10/21/chartex" xmlns:cx3="http://schemas.microsoft.com/office/drawing/2016/5/9/chartex" xmlns:cx4="http://schemas.microsoft.com/office/drawing/2016/5/10/chartex" xmlns:cx5="http://schemas.microsoft.com/office/drawing/2016/5/11/chartex" xmlns:cx6="http://schemas.microsoft.com/office/drawing/2016/5/12/chartex" xmlns:cx7="http://schemas.microsoft.com/office/drawing/2016/5/13/chartex" xmlns:cx8="http://schemas.microsoft.com/office/drawing/2016/5/14/chartex" xmlns:mc="http://schemas.openxmlformats.org/markup-compatibility/2006" xmlns:aink="http://schemas.microsoft.com/office/drawing/2016/ink" xmlns:am3d="http://schemas.microsoft.com/office/drawing/2017/model3d" xmlns:o="urn:schemas-microsoft-com:office:office" xmlns:oel="http://schemas.microsoft.com/office/2019/extlst" xmlns:r="http://schemas.openxmlformats.org/officeDocument/2006/relationships" xmlns:m="http://schemas.openxmlformats.org/officeDocument/2006/math" xmlns:v="urn:schemas-microsoft-com:vml" xmlns:wp14="http://schemas.microsoft.com/office/word/2010/wordprocessingDrawing" xmlns:wp="http://schemas.openxmlformats.org/drawingml/2006/wordprocessingDrawing" xmlns:w10="urn:schemas-microsoft-com:office:word" xmlns:w="http://schemas.openxmlformats.org/wordprocessingml/2006/main" xmlns:w14="http://schemas.microsoft.com/office/word/2010/wordml" xmlns:w15="http://schemas.microsoft.com/office/word/2012/wordml" xmlns:w16cex="http://schemas.microsoft.com/office/word/2018/wordml/cex" xmlns:w16cid="http://schemas.microsoft.com/office/word/2016/wordml/cid" xmlns:w16="http://schemas.microsoft.com/office/word/2018/wordml" xmlns:w16du="http://schemas.microsoft.com/office/word/2023/wordml/word16du" xmlns:w16sdtdh="http://schemas.microsoft.com/office/word/2020/wordml/sdtdatahash" xmlns:w16sdtfl="http://schemas.microsoft.com/office/word/2024/wordml/sdtformatlock" xmlns:w16se="http://schemas.microsoft.com/office/word/2015/wordml/symex" xmlns:wpg="http://schemas.microsoft.com/office/word/2010/wordprocessingGroup" xmlns:wpi="http://schemas.microsoft.com/office/word/2010/wordprocessingInk" xmlns:wne="http://schemas.microsoft.com/office/word/2006/wordml" xmlns:wps="http://schemas.microsoft.com/office/word/2010/wordprocessingShape" mc:Ignorable="w14 w15 w16se w16cid w16 w16cex w16sdtdh w16sdtfl w16du wp14">
+<w:ftr xmlns:wpc="http://schemas.microsoft.com/office/word/2010/wordprocessingCanvas" xmlns:cx="http://schemas.microsoft.com/office/drawing/2014/chartex" xmlns:cx1="http://schemas.microsoft.com/office/drawing/2015/9/8/chartex" xmlns:cx2="http://schemas.microsoft.com/office/drawing/2015/10/21/chartex" xmlns:cx3="http://schemas.microsoft.com/office/drawing/2016/5/9/chartex" xmlns:cx4="http://schemas.microsoft.com/office/drawing/2016/5/10/chartex" xmlns:cx5="http://schemas.microsoft.com/office/drawing/2016/5/11/chartex" xmlns:cx6="http://schemas.microsoft.com/office/drawing/2016/5/12/chartex" xmlns:cx7="http://schemas.microsoft.com/office/drawing/2016/5/13/chartex" xmlns:cx8="http://schemas.microsoft.com/office/drawing/2016/5/14/chartex" xmlns:mc="http://schemas.openxmlformats.org/markup-compatibility/2006" xmlns:aink="http://schemas.microsoft.com/office/drawing/2016/ink" xmlns:am3d="http://schemas.microsoft.com/office/drawing/2017/model3d" xmlns:o="urn:schemas-microsoft-com:office:office" xmlns:r="http://schemas.openxmlformats.org/officeDocument/2006/relationships" xmlns:m="http://schemas.openxmlformats.org/officeDocument/2006/math" xmlns:v="urn:schemas-microsoft-com:vml" xmlns:wp14="http://schemas.microsoft.com/office/word/2010/wordprocessingDrawing" xmlns:wp="http://schemas.openxmlformats.org/drawingml/2006/wordprocessingDrawing" xmlns:w10="urn:schemas-microsoft-com:office:word" xmlns:w="http://schemas.openxmlformats.org/wordprocessingml/2006/main" xmlns:w14="http://schemas.microsoft.com/office/word/2010/wordml" xmlns:w15="http://schemas.microsoft.com/office/word/2012/wordml" xmlns:w16cex="http://schemas.microsoft.com/office/word/2018/wordml/cex" xmlns:w16cid="http://schemas.microsoft.com/office/word/2016/wordml/cid" xmlns:w16="http://schemas.microsoft.com/office/word/2018/wordml" xmlns:w16sdtdh="http://schemas.microsoft.com/office/word/2020/wordml/sdtdatahash" xmlns:w16se="http://schemas.microsoft.com/office/word/2015/wordml/symex" xmlns:wpg="http://schemas.microsoft.com/office/word/2010/wordprocessingGroup" xmlns:wpi="http://schemas.microsoft.com/office/word/2010/wordprocessingInk" xmlns:wne="http://schemas.microsoft.com/office/word/2006/wordml" xmlns:wps="http://schemas.microsoft.com/office/word/2010/wordprocessingShape" mc:Ignorable="w14 w15 w16se w16cid w16 w16cex w16sdtdh wp14">
   <w:p>
     <w:pPr>
       <w:pStyle w:val="Rodap"/>
@@ -5682,17 +5587,8 @@
         <w:color w:val="61736C"/>
         <w:sz w:val="17"/>
       </w:rPr>
-      <w:t xml:space="preserve">CONTAÊ  •  </w:t>
+      <w:t>CONTAÊ  •  Persistência</w:t>
     </w:r>
-    <w:proofErr w:type="spellStart"/>
-    <w:r>
-      <w:rPr>
-        <w:color w:val="61736C"/>
-        <w:sz w:val="17"/>
-      </w:rPr>
-      <w:t>Persistência</w:t>
-    </w:r>
-    <w:proofErr w:type="spellEnd"/>
     <w:r>
       <w:rPr>
         <w:color w:val="61736C"/>
@@ -5741,7 +5637,7 @@
 </file>
 
 <file path=word/footnotes.xml><?xml version="1.0" encoding="utf-8"?>
-<w:footnotes xmlns:wpc="http://schemas.microsoft.com/office/word/2010/wordprocessingCanvas" xmlns:cx="http://schemas.microsoft.com/office/drawing/2014/chartex" xmlns:cx1="http://schemas.microsoft.com/office/drawing/2015/9/8/chartex" xmlns:cx2="http://schemas.microsoft.com/office/drawing/2015/10/21/chartex" xmlns:cx3="http://schemas.microsoft.com/office/drawing/2016/5/9/chartex" xmlns:cx4="http://schemas.microsoft.com/office/drawing/2016/5/10/chartex" xmlns:cx5="http://schemas.microsoft.com/office/drawing/2016/5/11/chartex" xmlns:cx6="http://schemas.microsoft.com/office/drawing/2016/5/12/chartex" xmlns:cx7="http://schemas.microsoft.com/office/drawing/2016/5/13/chartex" xmlns:cx8="http://schemas.microsoft.com/office/drawing/2016/5/14/chartex" xmlns:mc="http://schemas.openxmlformats.org/markup-compatibility/2006" xmlns:aink="http://schemas.microsoft.com/office/drawing/2016/ink" xmlns:am3d="http://schemas.microsoft.com/office/drawing/2017/model3d" xmlns:o="urn:schemas-microsoft-com:office:office" xmlns:oel="http://schemas.microsoft.com/office/2019/extlst" xmlns:r="http://schemas.openxmlformats.org/officeDocument/2006/relationships" xmlns:m="http://schemas.openxmlformats.org/officeDocument/2006/math" xmlns:v="urn:schemas-microsoft-com:vml" xmlns:wp14="http://schemas.microsoft.com/office/word/2010/wordprocessingDrawing" xmlns:wp="http://schemas.openxmlformats.org/drawingml/2006/wordprocessingDrawing" xmlns:w10="urn:schemas-microsoft-com:office:word" xmlns:w="http://schemas.openxmlformats.org/wordprocessingml/2006/main" xmlns:w14="http://schemas.microsoft.com/office/word/2010/wordml" xmlns:w15="http://schemas.microsoft.com/office/word/2012/wordml" xmlns:w16cex="http://schemas.microsoft.com/office/word/2018/wordml/cex" xmlns:w16cid="http://schemas.microsoft.com/office/word/2016/wordml/cid" xmlns:w16="http://schemas.microsoft.com/office/word/2018/wordml" xmlns:w16du="http://schemas.microsoft.com/office/word/2023/wordml/word16du" xmlns:w16sdtdh="http://schemas.microsoft.com/office/word/2020/wordml/sdtdatahash" xmlns:w16sdtfl="http://schemas.microsoft.com/office/word/2024/wordml/sdtformatlock" xmlns:w16se="http://schemas.microsoft.com/office/word/2015/wordml/symex" xmlns:wpg="http://schemas.microsoft.com/office/word/2010/wordprocessingGroup" xmlns:wpi="http://schemas.microsoft.com/office/word/2010/wordprocessingInk" xmlns:wne="http://schemas.microsoft.com/office/word/2006/wordml" xmlns:wps="http://schemas.microsoft.com/office/word/2010/wordprocessingShape" mc:Ignorable="w14 w15 w16se w16cid w16 w16cex w16sdtdh w16sdtfl w16du wp14">
+<w:footnotes xmlns:wpc="http://schemas.microsoft.com/office/word/2010/wordprocessingCanvas" xmlns:cx="http://schemas.microsoft.com/office/drawing/2014/chartex" xmlns:cx1="http://schemas.microsoft.com/office/drawing/2015/9/8/chartex" xmlns:cx2="http://schemas.microsoft.com/office/drawing/2015/10/21/chartex" xmlns:cx3="http://schemas.microsoft.com/office/drawing/2016/5/9/chartex" xmlns:cx4="http://schemas.microsoft.com/office/drawing/2016/5/10/chartex" xmlns:cx5="http://schemas.microsoft.com/office/drawing/2016/5/11/chartex" xmlns:cx6="http://schemas.microsoft.com/office/drawing/2016/5/12/chartex" xmlns:cx7="http://schemas.microsoft.com/office/drawing/2016/5/13/chartex" xmlns:cx8="http://schemas.microsoft.com/office/drawing/2016/5/14/chartex" xmlns:mc="http://schemas.openxmlformats.org/markup-compatibility/2006" xmlns:aink="http://schemas.microsoft.com/office/drawing/2016/ink" xmlns:am3d="http://schemas.microsoft.com/office/drawing/2017/model3d" xmlns:o="urn:schemas-microsoft-com:office:office" xmlns:r="http://schemas.openxmlformats.org/officeDocument/2006/relationships" xmlns:m="http://schemas.openxmlformats.org/officeDocument/2006/math" xmlns:v="urn:schemas-microsoft-com:vml" xmlns:wp14="http://schemas.microsoft.com/office/word/2010/wordprocessingDrawing" xmlns:wp="http://schemas.openxmlformats.org/drawingml/2006/wordprocessingDrawing" xmlns:w10="urn:schemas-microsoft-com:office:word" xmlns:w="http://schemas.openxmlformats.org/wordprocessingml/2006/main" xmlns:w14="http://schemas.microsoft.com/office/word/2010/wordml" xmlns:w15="http://schemas.microsoft.com/office/word/2012/wordml" xmlns:w16cex="http://schemas.microsoft.com/office/word/2018/wordml/cex" xmlns:w16cid="http://schemas.microsoft.com/office/word/2016/wordml/cid" xmlns:w16="http://schemas.microsoft.com/office/word/2018/wordml" xmlns:w16sdtdh="http://schemas.microsoft.com/office/word/2020/wordml/sdtdatahash" xmlns:w16se="http://schemas.microsoft.com/office/word/2015/wordml/symex" xmlns:wpg="http://schemas.microsoft.com/office/word/2010/wordprocessingGroup" xmlns:wpi="http://schemas.microsoft.com/office/word/2010/wordprocessingInk" xmlns:wne="http://schemas.microsoft.com/office/word/2006/wordml" xmlns:wps="http://schemas.microsoft.com/office/word/2010/wordprocessingShape" mc:Ignorable="w14 w15 w16se w16cid w16 w16cex w16sdtdh wp14">
   <w:footnote w:type="separator" w:id="-1">
     <w:p>
       <w:pPr>
@@ -5766,7 +5662,7 @@
 </file>
 
 <file path=word/header1.xml><?xml version="1.0" encoding="utf-8"?>
-<w:hdr xmlns:wpc="http://schemas.microsoft.com/office/word/2010/wordprocessingCanvas" xmlns:cx="http://schemas.microsoft.com/office/drawing/2014/chartex" xmlns:cx1="http://schemas.microsoft.com/office/drawing/2015/9/8/chartex" xmlns:cx2="http://schemas.microsoft.com/office/drawing/2015/10/21/chartex" xmlns:cx3="http://schemas.microsoft.com/office/drawing/2016/5/9/chartex" xmlns:cx4="http://schemas.microsoft.com/office/drawing/2016/5/10/chartex" xmlns:cx5="http://schemas.microsoft.com/office/drawing/2016/5/11/chartex" xmlns:cx6="http://schemas.microsoft.com/office/drawing/2016/5/12/chartex" xmlns:cx7="http://schemas.microsoft.com/office/drawing/2016/5/13/chartex" xmlns:cx8="http://schemas.microsoft.com/office/drawing/2016/5/14/chartex" xmlns:mc="http://schemas.openxmlformats.org/markup-compatibility/2006" xmlns:aink="http://schemas.microsoft.com/office/drawing/2016/ink" xmlns:am3d="http://schemas.microsoft.com/office/drawing/2017/model3d" xmlns:o="urn:schemas-microsoft-com:office:office" xmlns:oel="http://schemas.microsoft.com/office/2019/extlst" xmlns:r="http://schemas.openxmlformats.org/officeDocument/2006/relationships" xmlns:m="http://schemas.openxmlformats.org/officeDocument/2006/math" xmlns:v="urn:schemas-microsoft-com:vml" xmlns:wp14="http://schemas.microsoft.com/office/word/2010/wordprocessingDrawing" xmlns:wp="http://schemas.openxmlformats.org/drawingml/2006/wordprocessingDrawing" xmlns:w10="urn:schemas-microsoft-com:office:word" xmlns:w="http://schemas.openxmlformats.org/wordprocessingml/2006/main" xmlns:w14="http://schemas.microsoft.com/office/word/2010/wordml" xmlns:w15="http://schemas.microsoft.com/office/word/2012/wordml" xmlns:w16cex="http://schemas.microsoft.com/office/word/2018/wordml/cex" xmlns:w16cid="http://schemas.microsoft.com/office/word/2016/wordml/cid" xmlns:w16="http://schemas.microsoft.com/office/word/2018/wordml" xmlns:w16du="http://schemas.microsoft.com/office/word/2023/wordml/word16du" xmlns:w16sdtdh="http://schemas.microsoft.com/office/word/2020/wordml/sdtdatahash" xmlns:w16sdtfl="http://schemas.microsoft.com/office/word/2024/wordml/sdtformatlock" xmlns:w16se="http://schemas.microsoft.com/office/word/2015/wordml/symex" xmlns:wpg="http://schemas.microsoft.com/office/word/2010/wordprocessingGroup" xmlns:wpi="http://schemas.microsoft.com/office/word/2010/wordprocessingInk" xmlns:wne="http://schemas.microsoft.com/office/word/2006/wordml" xmlns:wps="http://schemas.microsoft.com/office/word/2010/wordprocessingShape" mc:Ignorable="w14 w15 w16se w16cid w16 w16cex w16sdtdh w16sdtfl w16du wp14">
+<w:hdr xmlns:wpc="http://schemas.microsoft.com/office/word/2010/wordprocessingCanvas" xmlns:cx="http://schemas.microsoft.com/office/drawing/2014/chartex" xmlns:cx1="http://schemas.microsoft.com/office/drawing/2015/9/8/chartex" xmlns:cx2="http://schemas.microsoft.com/office/drawing/2015/10/21/chartex" xmlns:cx3="http://schemas.microsoft.com/office/drawing/2016/5/9/chartex" xmlns:cx4="http://schemas.microsoft.com/office/drawing/2016/5/10/chartex" xmlns:cx5="http://schemas.microsoft.com/office/drawing/2016/5/11/chartex" xmlns:cx6="http://schemas.microsoft.com/office/drawing/2016/5/12/chartex" xmlns:cx7="http://schemas.microsoft.com/office/drawing/2016/5/13/chartex" xmlns:cx8="http://schemas.microsoft.com/office/drawing/2016/5/14/chartex" xmlns:mc="http://schemas.openxmlformats.org/markup-compatibility/2006" xmlns:aink="http://schemas.microsoft.com/office/drawing/2016/ink" xmlns:am3d="http://schemas.microsoft.com/office/drawing/2017/model3d" xmlns:o="urn:schemas-microsoft-com:office:office" xmlns:r="http://schemas.openxmlformats.org/officeDocument/2006/relationships" xmlns:m="http://schemas.openxmlformats.org/officeDocument/2006/math" xmlns:v="urn:schemas-microsoft-com:vml" xmlns:wp14="http://schemas.microsoft.com/office/word/2010/wordprocessingDrawing" xmlns:wp="http://schemas.openxmlformats.org/drawingml/2006/wordprocessingDrawing" xmlns:w10="urn:schemas-microsoft-com:office:word" xmlns:w="http://schemas.openxmlformats.org/wordprocessingml/2006/main" xmlns:w14="http://schemas.microsoft.com/office/word/2010/wordml" xmlns:w15="http://schemas.microsoft.com/office/word/2012/wordml" xmlns:w16cex="http://schemas.microsoft.com/office/word/2018/wordml/cex" xmlns:w16cid="http://schemas.microsoft.com/office/word/2016/wordml/cid" xmlns:w16="http://schemas.microsoft.com/office/word/2018/wordml" xmlns:w16sdtdh="http://schemas.microsoft.com/office/word/2020/wordml/sdtdatahash" xmlns:w16se="http://schemas.microsoft.com/office/word/2015/wordml/symex" xmlns:wpg="http://schemas.microsoft.com/office/word/2010/wordprocessingGroup" xmlns:wpi="http://schemas.microsoft.com/office/word/2010/wordprocessingInk" xmlns:wne="http://schemas.microsoft.com/office/word/2006/wordml" xmlns:wps="http://schemas.microsoft.com/office/word/2010/wordprocessingShape" mc:Ignorable="w14 w15 w16se w16cid w16 w16cex w16sdtdh wp14">
   <w:p>
     <w:pPr>
       <w:pStyle w:val="Cabealho"/>
@@ -5796,7 +5692,7 @@
 </file>
 
 <file path=word/numbering.xml><?xml version="1.0" encoding="utf-8"?>
-<w:numbering xmlns:wpc="http://schemas.microsoft.com/office/word/2010/wordprocessingCanvas" xmlns:cx="http://schemas.microsoft.com/office/drawing/2014/chartex" xmlns:cx1="http://schemas.microsoft.com/office/drawing/2015/9/8/chartex" xmlns:cx2="http://schemas.microsoft.com/office/drawing/2015/10/21/chartex" xmlns:cx3="http://schemas.microsoft.com/office/drawing/2016/5/9/chartex" xmlns:cx4="http://schemas.microsoft.com/office/drawing/2016/5/10/chartex" xmlns:cx5="http://schemas.microsoft.com/office/drawing/2016/5/11/chartex" xmlns:cx6="http://schemas.microsoft.com/office/drawing/2016/5/12/chartex" xmlns:cx7="http://schemas.microsoft.com/office/drawing/2016/5/13/chartex" xmlns:cx8="http://schemas.microsoft.com/office/drawing/2016/5/14/chartex" xmlns:mc="http://schemas.openxmlformats.org/markup-compatibility/2006" xmlns:aink="http://schemas.microsoft.com/office/drawing/2016/ink" xmlns:am3d="http://schemas.microsoft.com/office/drawing/2017/model3d" xmlns:o="urn:schemas-microsoft-com:office:office" xmlns:oel="http://schemas.microsoft.com/office/2019/extlst" xmlns:r="http://schemas.openxmlformats.org/officeDocument/2006/relationships" xmlns:m="http://schemas.openxmlformats.org/officeDocument/2006/math" xmlns:v="urn:schemas-microsoft-com:vml" xmlns:wp14="http://schemas.microsoft.com/office/word/2010/wordprocessingDrawing" xmlns:wp="http://schemas.openxmlformats.org/drawingml/2006/wordprocessingDrawing" xmlns:w10="urn:schemas-microsoft-com:office:word" xmlns:w="http://schemas.openxmlformats.org/wordprocessingml/2006/main" xmlns:w14="http://schemas.microsoft.com/office/word/2010/wordml" xmlns:w15="http://schemas.microsoft.com/office/word/2012/wordml" xmlns:w16cex="http://schemas.microsoft.com/office/word/2018/wordml/cex" xmlns:w16cid="http://schemas.microsoft.com/office/word/2016/wordml/cid" xmlns:w16="http://schemas.microsoft.com/office/word/2018/wordml" xmlns:w16du="http://schemas.microsoft.com/office/word/2023/wordml/word16du" xmlns:w16sdtdh="http://schemas.microsoft.com/office/word/2020/wordml/sdtdatahash" xmlns:w16sdtfl="http://schemas.microsoft.com/office/word/2024/wordml/sdtformatlock" xmlns:w16se="http://schemas.microsoft.com/office/word/2015/wordml/symex" xmlns:wpg="http://schemas.microsoft.com/office/word/2010/wordprocessingGroup" xmlns:wpi="http://schemas.microsoft.com/office/word/2010/wordprocessingInk" xmlns:wne="http://schemas.microsoft.com/office/word/2006/wordml" xmlns:wps="http://schemas.microsoft.com/office/word/2010/wordprocessingShape" mc:Ignorable="w14 w15 w16se w16cid w16 w16cex w16sdtdh w16sdtfl w16du wp14">
+<w:numbering xmlns:wpc="http://schemas.microsoft.com/office/word/2010/wordprocessingCanvas" xmlns:cx="http://schemas.microsoft.com/office/drawing/2014/chartex" xmlns:cx1="http://schemas.microsoft.com/office/drawing/2015/9/8/chartex" xmlns:cx2="http://schemas.microsoft.com/office/drawing/2015/10/21/chartex" xmlns:cx3="http://schemas.microsoft.com/office/drawing/2016/5/9/chartex" xmlns:cx4="http://schemas.microsoft.com/office/drawing/2016/5/10/chartex" xmlns:cx5="http://schemas.microsoft.com/office/drawing/2016/5/11/chartex" xmlns:cx6="http://schemas.microsoft.com/office/drawing/2016/5/12/chartex" xmlns:cx7="http://schemas.microsoft.com/office/drawing/2016/5/13/chartex" xmlns:cx8="http://schemas.microsoft.com/office/drawing/2016/5/14/chartex" xmlns:mc="http://schemas.openxmlformats.org/markup-compatibility/2006" xmlns:aink="http://schemas.microsoft.com/office/drawing/2016/ink" xmlns:am3d="http://schemas.microsoft.com/office/drawing/2017/model3d" xmlns:o="urn:schemas-microsoft-com:office:office" xmlns:r="http://schemas.openxmlformats.org/officeDocument/2006/relationships" xmlns:m="http://schemas.openxmlformats.org/officeDocument/2006/math" xmlns:v="urn:schemas-microsoft-com:vml" xmlns:wp14="http://schemas.microsoft.com/office/word/2010/wordprocessingDrawing" xmlns:wp="http://schemas.openxmlformats.org/drawingml/2006/wordprocessingDrawing" xmlns:w10="urn:schemas-microsoft-com:office:word" xmlns:w="http://schemas.openxmlformats.org/wordprocessingml/2006/main" xmlns:w14="http://schemas.microsoft.com/office/word/2010/wordml" xmlns:w15="http://schemas.microsoft.com/office/word/2012/wordml" xmlns:w16cex="http://schemas.microsoft.com/office/word/2018/wordml/cex" xmlns:w16cid="http://schemas.microsoft.com/office/word/2016/wordml/cid" xmlns:w16="http://schemas.microsoft.com/office/word/2018/wordml" xmlns:w16sdtdh="http://schemas.microsoft.com/office/word/2020/wordml/sdtdatahash" xmlns:w16se="http://schemas.microsoft.com/office/word/2015/wordml/symex" xmlns:wpg="http://schemas.microsoft.com/office/word/2010/wordprocessingGroup" xmlns:wpi="http://schemas.microsoft.com/office/word/2010/wordprocessingInk" xmlns:wne="http://schemas.microsoft.com/office/word/2006/wordml" xmlns:wps="http://schemas.microsoft.com/office/word/2010/wordprocessingShape" mc:Ignorable="w14 w15 w16se w16cid w16 w16cex w16sdtdh wp14">
   <w:abstractNum w:abstractNumId="0" w15:restartNumberingAfterBreak="0">
     <w:nsid w:val="FFFFFF7C"/>
     <w:multiLevelType w:val="singleLevel"/>
@@ -5968,38 +5864,38 @@
       </w:rPr>
     </w:lvl>
   </w:abstractNum>
-  <w:num w:numId="1" w16cid:durableId="406923732">
+  <w:num w:numId="1">
     <w:abstractNumId w:val="8"/>
   </w:num>
-  <w:num w:numId="2" w16cid:durableId="1738624669">
+  <w:num w:numId="2">
     <w:abstractNumId w:val="6"/>
   </w:num>
-  <w:num w:numId="3" w16cid:durableId="19821516">
+  <w:num w:numId="3">
     <w:abstractNumId w:val="5"/>
   </w:num>
-  <w:num w:numId="4" w16cid:durableId="575865549">
+  <w:num w:numId="4">
     <w:abstractNumId w:val="4"/>
   </w:num>
-  <w:num w:numId="5" w16cid:durableId="1487041923">
+  <w:num w:numId="5">
     <w:abstractNumId w:val="7"/>
   </w:num>
-  <w:num w:numId="6" w16cid:durableId="685988019">
+  <w:num w:numId="6">
     <w:abstractNumId w:val="3"/>
   </w:num>
-  <w:num w:numId="7" w16cid:durableId="538205116">
+  <w:num w:numId="7">
     <w:abstractNumId w:val="2"/>
   </w:num>
-  <w:num w:numId="8" w16cid:durableId="1351684312">
+  <w:num w:numId="8">
     <w:abstractNumId w:val="1"/>
   </w:num>
-  <w:num w:numId="9" w16cid:durableId="869607226">
+  <w:num w:numId="9">
     <w:abstractNumId w:val="0"/>
   </w:num>
 </w:numbering>
 </file>
 
 <file path=word/styles.xml><?xml version="1.0" encoding="utf-8"?>
-<w:styles xmlns:mc="http://schemas.openxmlformats.org/markup-compatibility/2006" xmlns:r="http://schemas.openxmlformats.org/officeDocument/2006/relationships" xmlns:w="http://schemas.openxmlformats.org/wordprocessingml/2006/main" xmlns:w14="http://schemas.microsoft.com/office/word/2010/wordml" xmlns:w15="http://schemas.microsoft.com/office/word/2012/wordml" xmlns:w16cex="http://schemas.microsoft.com/office/word/2018/wordml/cex" xmlns:w16cid="http://schemas.microsoft.com/office/word/2016/wordml/cid" xmlns:w16="http://schemas.microsoft.com/office/word/2018/wordml" xmlns:w16du="http://schemas.microsoft.com/office/word/2023/wordml/word16du" xmlns:w16sdtdh="http://schemas.microsoft.com/office/word/2020/wordml/sdtdatahash" xmlns:w16sdtfl="http://schemas.microsoft.com/office/word/2024/wordml/sdtformatlock" xmlns:w16se="http://schemas.microsoft.com/office/word/2015/wordml/symex" mc:Ignorable="w14 w15 w16se w16cid w16 w16cex w16sdtdh w16sdtfl w16du">
+<w:styles xmlns:mc="http://schemas.openxmlformats.org/markup-compatibility/2006" xmlns:r="http://schemas.openxmlformats.org/officeDocument/2006/relationships" xmlns:w="http://schemas.openxmlformats.org/wordprocessingml/2006/main" xmlns:w14="http://schemas.microsoft.com/office/word/2010/wordml" xmlns:w15="http://schemas.microsoft.com/office/word/2012/wordml" xmlns:w16cex="http://schemas.microsoft.com/office/word/2018/wordml/cex" xmlns:w16cid="http://schemas.microsoft.com/office/word/2016/wordml/cid" xmlns:w16="http://schemas.microsoft.com/office/word/2018/wordml" xmlns:w16sdtdh="http://schemas.microsoft.com/office/word/2020/wordml/sdtdatahash" xmlns:w16se="http://schemas.microsoft.com/office/word/2015/wordml/symex" mc:Ignorable="w14 w15 w16se w16cid w16 w16cex w16sdtdh">
   <w:docDefaults>
     <w:rPrDefault>
       <w:rPr>
@@ -6609,6 +6505,7 @@
   <w:style w:type="character" w:default="1" w:styleId="Fontepargpadro">
     <w:name w:val="Default Paragraph Font"/>
     <w:uiPriority w:val="1"/>
+    <w:semiHidden/>
     <w:unhideWhenUsed/>
   </w:style>
   <w:style w:type="table" w:default="1" w:styleId="Tabelanormal">

</xml_diff>